<commit_message>
Actualizar contexto y plan: recuperación de contraseña (P1 #4) y previsualizar contraseña completadas
- CONTEXTO.md: documenta el flujo de recuperación de contraseña
  implementado (evento PASSWORD_RECOVERY, captura temprana del hash de
  recovery, AUTH_MODES) y su verificación E2E, más la mejora de
  previsualizar contraseña agregada durante esa verificación.
- docs/Plan_de_Avance_MVP.docx: marca P1 #4 como completada, agrega
  sección de detalle de implementación + previsualizar contraseña,
  y actualiza próximos pasos y criterio de asignación de agentes.
</commit_message>
<xml_diff>
--- a/docs/Plan_de_Avance_MVP.docx
+++ b/docs/Plan_de_Avance_MVP.docx
@@ -36,7 +36,7 @@
           <w:i/>
           <w:iCs/>
         </w:rPr>
-        <w:t xml:space="preserve">Actualizado el 2026-07-15 · Versión unificada (incluye plan original + hallazgos de la sesión de verificación E2E + resultado de la verificación E2E en producción)</w:t>
+        <w:t xml:space="preserve">Actualizado el 2026-07-15 · Versión unificada (incluye plan original + hallazgos de la sesión de verificación E2E + resultado de la verificación E2E en producción + recuperación de contraseña completada + previsualizar contraseña)</w:t>
       </w:r>
     </w:p>
     <w:p>
@@ -74,6 +74,20 @@
           <w:iCs w:val="false"/>
         </w:rPr>
         <w:t xml:space="preserve">La verificación E2E contra producción (P0 #3) ya se completó el 2026-07-15, con resultado exitoso en todos los pasos y sin regresiones — ver detalle en la sección dedicada más abajo.</w:t>
+      </w:r>
+    </w:p>
+    <w:p>
+      <w:pPr>
+        <w:spacing w:after="120"/>
+      </w:pPr>
+      <w:r>
+        <w:rPr>
+          <w:b w:val="false"/>
+          <w:bCs w:val="false"/>
+          <w:i w:val="false"/>
+          <w:iCs w:val="false"/>
+        </w:rPr>
+        <w:t xml:space="preserve">La recuperación de contraseña (P1 #4) también se completó el 2026-07-15, con verificación E2E real y una mejora adicional de previsualizar contraseña agregada a partir de feedback directo del usuario — ver sección dedicada.</w:t>
       </w:r>
     </w:p>
     <w:p>
@@ -877,7 +891,131 @@
         <w:spacing w:after="150" w:before="300"/>
       </w:pPr>
       <w:r>
-        <w:t xml:space="preserve">Prioridad P1 — Core faltante (sin cambios respecto al plan original)</w:t>
+        <w:t xml:space="preserve">Recuperación de contraseña (P1 #4) — completada el 2026-07-15</w:t>
+      </w:r>
+    </w:p>
+    <w:p>
+      <w:pPr>
+        <w:spacing w:after="120"/>
+      </w:pPr>
+      <w:r>
+        <w:rPr>
+          <w:b w:val="false"/>
+          <w:bCs w:val="false"/>
+          <w:i w:val="false"/>
+          <w:iCs w:val="false"/>
+        </w:rPr>
+        <w:t xml:space="preserve">Diseñada a alto nivel en la sesión del 2026-07-11 (evento PASSWORD_RECOVERY, nuevo estado de pantalla, redirect URLs en Supabase), implementada y verificada E2E en esta sesión. Commits 6674da3 (flujo completo) y 8e6736d (previsualizar contraseña).</w:t>
+      </w:r>
+    </w:p>
+    <w:p>
+      <w:pPr>
+        <w:pStyle w:val="ListParagraph"/>
+        <w:numPr>
+          <w:ilvl w:val="0"/>
+          <w:numId w:val="1"/>
+        </w:numPr>
+        <w:spacing w:after="80"/>
+      </w:pPr>
+      <w:r>
+        <w:t xml:space="preserve">Enlace '¿Olvidaste tu contraseña?' en el login pasa el formulario a modo recover (solo pide correo); requestPasswordReset() llama a resetPasswordForEmail y muestra un mensaje neutro, sin revelar si el correo existe.</w:t>
+      </w:r>
+    </w:p>
+    <w:p>
+      <w:pPr>
+        <w:pStyle w:val="ListParagraph"/>
+        <w:numPr>
+          <w:ilvl w:val="0"/>
+          <w:numId w:val="1"/>
+        </w:numPr>
+        <w:spacing w:after="80"/>
+      </w:pPr>
+      <w:r>
+        <w:t xml:space="preserve">El enlace del correo vuelve con #type=recovery en la URL. Se captura en un &lt;script&gt; inline en el &lt;head&gt; de index.html, antes de que cargue el bundle de supabase-js — createClient() limpia ese hash apenas se importa, así que capturarlo dentro de main.js llegaba tarde.</w:t>
+      </w:r>
+    </w:p>
+    <w:p>
+      <w:pPr>
+        <w:pStyle w:val="ListParagraph"/>
+        <w:numPr>
+          <w:ilvl w:val="0"/>
+          <w:numId w:val="1"/>
+        </w:numPr>
+        <w:spacing w:after="80"/>
+      </w:pPr>
+      <w:r>
+        <w:t xml:space="preserve">El evento PASSWORD_RECOVERY de onAuthStateChange intercepta la sesión temporal del enlace y fuerza el modo reset (nueva contraseña + repetir), sin dejar que la app haga bootstrap con esa sesión.</w:t>
+      </w:r>
+    </w:p>
+    <w:p>
+      <w:pPr>
+        <w:pStyle w:val="ListParagraph"/>
+        <w:numPr>
+          <w:ilvl w:val="0"/>
+          <w:numId w:val="1"/>
+        </w:numPr>
+        <w:spacing w:after="80"/>
+      </w:pPr>
+      <w:r>
+        <w:t xml:space="preserve">Al confirmar, updatePassword() llama a supabase.auth.updateUser({ password }), se cierra la sesión temporal (signOut), se limpia el hash de la URL y se vuelve al login con mensaje de éxito — el usuario inicia sesión de nuevo con la contraseña nueva.</w:t>
+      </w:r>
+    </w:p>
+    <w:p>
+      <w:pPr>
+        <w:pStyle w:val="ListParagraph"/>
+        <w:numPr>
+          <w:ilvl w:val="0"/>
+          <w:numId w:val="1"/>
+        </w:numPr>
+        <w:spacing w:after="80"/>
+      </w:pPr>
+      <w:r>
+        <w:t xml:space="preserve">Toda la lógica de estados (signin / signup / recover / reset) quedó centralizada en un objeto AUTH_MODES en main.js.</w:t>
+      </w:r>
+    </w:p>
+    <w:p>
+      <w:pPr>
+        <w:pStyle w:val="ListParagraph"/>
+        <w:numPr>
+          <w:ilvl w:val="0"/>
+          <w:numId w:val="1"/>
+        </w:numPr>
+        <w:spacing w:after="80"/>
+      </w:pPr>
+      <w:r>
+        <w:t xml:space="preserve">Verificación E2E: flujo real de punta a punta con el correo del propio usuario (dacn.2026@gmail.com) contra saludfamilia.vercel.app. Confirmado por SQL en Supabase (token de recuperación generado y consumido) y por el salto fresco de last_sign_in_at tras el login con la contraseña nueva.</w:t>
+      </w:r>
+    </w:p>
+    <w:p>
+      <w:pPr>
+        <w:pStyle w:val="Heading2"/>
+        <w:spacing w:after="120" w:before="240"/>
+      </w:pPr>
+      <w:r>
+        <w:t xml:space="preserve">Previsualizar contraseña (mejora agregada durante la sesión, no planeada originalmente)</w:t>
+      </w:r>
+    </w:p>
+    <w:p>
+      <w:pPr>
+        <w:spacing w:after="120"/>
+      </w:pPr>
+      <w:r>
+        <w:rPr>
+          <w:b w:val="false"/>
+          <w:bCs w:val="false"/>
+          <w:i w:val="false"/>
+          <w:iCs w:val="false"/>
+        </w:rPr>
+        <w:t xml:space="preserve">Durante la verificación E2E de recuperación, el usuario señaló que no existía forma de previsualizar la contraseña antes de iniciar sesión, lo que puede llevar a errores de tipeo constantes al momento de loguearse. Se agregó un botón de mostrar/ocultar (íconos ojo / ojo tachado) en los campos de contraseña y repetir contraseña del formulario de auth, reseteado a oculto cada vez que cambia el modo del formulario. Verificado por el usuario en producción.</w:t>
+      </w:r>
+    </w:p>
+    <w:p>
+      <w:pPr>
+        <w:pStyle w:val="Heading1"/>
+        <w:spacing w:after="150" w:before="300"/>
+      </w:pPr>
+      <w:r>
+        <w:t xml:space="preserve">Prioridad P1 — Core faltante (sin cambios respecto al plan original, salvo P1 #4)</w:t>
       </w:r>
     </w:p>
     <w:tbl>
@@ -1013,15 +1151,16 @@
         <w:tc>
           <w:tcPr>
             <w:tcW w:type="dxa" w:w="5200"/>
-            <w:vAlign w:val="center"/>
-          </w:tcPr>
-          <w:p>
-            <w:r>
-              <w:rPr>
-                <w:b w:val="false"/>
-                <w:bCs w:val="false"/>
-              </w:rPr>
-              <w:t xml:space="preserve">Diseño conversado a alto nivel en la sesión del 2026-07-11 (evento PASSWORD_RECOVERY, nuevo estado de pantalla, redirect URLs en Supabase). Flujo de auth con estados y redirects entre varias vistas — no implementado aún.</w:t>
+            <w:shd w:fill="E2EFDA" w:val="clear"/>
+            <w:vAlign w:val="center"/>
+          </w:tcPr>
+          <w:p>
+            <w:r>
+              <w:rPr>
+                <w:b w:val="false"/>
+                <w:bCs w:val="false"/>
+              </w:rPr>
+              <w:t xml:space="preserve">✅ Completada el 2026-07-15. Ver sección dedicada 'Recuperación de contraseña (P1 #4)' más arriba, con el detalle de implementación, la mejora de previsualizar contraseña y la verificación E2E.</w:t>
             </w:r>
           </w:p>
         </w:tc>
@@ -3598,7 +3737,7 @@
                 <w:b w:val="false"/>
                 <w:bCs w:val="false"/>
               </w:rPr>
-              <w:t xml:space="preserve">Flujos que cruzan varios archivos y estados: recuperación de contraseña. (La verificación E2E con criterio, antes asignada a Opus, ya se completó el 2026-07-15.)</w:t>
+              <w:t xml:space="preserve">Flujos que cruzan varios archivos y estados. La recuperación de contraseña (el caso que motivó este criterio) ya se completó y verificó E2E el 2026-07-15; no queda ningún ítem de este tipo pendiente por ahora.</w:t>
             </w:r>
           </w:p>
         </w:tc>
@@ -3730,19 +3869,6 @@
       </w:pPr>
       <w:r>
         <w:t xml:space="preserve">Ejecutar la sección de edición de interfaz (P1.5) con Sonnet, módulo por módulo, empezando por el patrón transversal 'Otra extensible' y el de imágenes ampliables, ya que se repiten en varios módulos.</w:t>
-      </w:r>
-    </w:p>
-    <w:p>
-      <w:pPr>
-        <w:pStyle w:val="ListParagraph"/>
-        <w:numPr>
-          <w:ilvl w:val="0"/>
-          <w:numId w:val="1"/>
-        </w:numPr>
-        <w:spacing w:after="80"/>
-      </w:pPr>
-      <w:r>
-        <w:t xml:space="preserve">Implementar recuperación de contraseña (P1 #4) con Opus.</w:t>
       </w:r>
     </w:p>
     <w:p>

</xml_diff>

<commit_message>
Actualizar contexto y plan: P1 completa (invitaciones, exportar/importar, Storage, auditoría RLS)
- CONTEXTO.md: secciones nuevas para P1 #6 (invitaciones multiusuario,
  E2E completo en producción), pieza B (exportar/importar como archivo
  cifrado — diseño distinto al original), P1 #7 (adjuntos en Storage,
  E2E por UI pendiente) y P1 #8 (auditoría RLS: hallazgos, fixes y
  aceptados). Árbol de arquitectura con las migraciones 0005-0008 y los
  módulos nuevos, estado de datos actualizado, infraestructura (plan
  gratuito: leaked password protection requiere Pro; mínimo de
  contraseña 8), criterio de agentes y próximos pasos al día.
- Plan_de_Avance_MVP.docx: tabla P1 completa en verde, sección de
  resultados de la sesión 2026-07-15/16, pieza B marcada completada con
  nota del cambio de diseño, próximos pasos actualizados.

Co-Authored-By: Claude Fable 5 <noreply@anthropic.com>
</commit_message>
<xml_diff>
--- a/docs/Plan_de_Avance_MVP.docx
+++ b/docs/Plan_de_Avance_MVP.docx
@@ -36,7 +36,7 @@
           <w:i/>
           <w:iCs/>
         </w:rPr>
-        <w:t xml:space="preserve">Actualizado el 2026-07-15 · Versión unificada (incluye plan original + hallazgos de la sesión de verificación E2E + resultado de la verificación E2E en producción + recuperación de contraseña completada + previsualizar contraseña)</w:t>
+        <w:t xml:space="preserve">Actualizado el 2026-07-16 · Versión unificada (plan original + verificación E2E en producción + recuperación de contraseña + invitaciones al household + exportar/importar pacientes + adjuntos en Storage + auditoría de seguridad RLS)</w:t>
       </w:r>
     </w:p>
     <w:p>
@@ -59,7 +59,7 @@
           <w:i w:val="false"/>
           <w:iCs w:val="false"/>
         </w:rPr>
-        <w:t xml:space="preserve">El CRUD principal de la aplicación ya está construido y fue verificado de punta a punta en entorno local: autenticación con aislamiento por familia (RLS), pacientes, órdenes médicas con etapas, medicamentos, signos vitales, centros médicos, médicos y dashboard. Esto representa aproximadamente el 70% de las funcionalidades CORE.</w:t>
+        <w:t xml:space="preserve">El CRUD principal de la aplicación ya está construido y verificado E2E en producción: autenticación con aislamiento por familia (RLS), pacientes, órdenes médicas con etapas, medicamentos, signos vitales, centros médicos, médicos y dashboard.</w:t>
       </w:r>
     </w:p>
     <w:p>
@@ -73,35 +73,7 @@
           <w:i w:val="false"/>
           <w:iCs w:val="false"/>
         </w:rPr>
-        <w:t xml:space="preserve">La verificación E2E contra producción (P0 #3) ya se completó el 2026-07-15, con resultado exitoso en todos los pasos y sin regresiones — ver detalle en la sección dedicada más abajo.</w:t>
-      </w:r>
-    </w:p>
-    <w:p>
-      <w:pPr>
-        <w:spacing w:after="120"/>
-      </w:pPr>
-      <w:r>
-        <w:rPr>
-          <w:b w:val="false"/>
-          <w:bCs w:val="false"/>
-          <w:i w:val="false"/>
-          <w:iCs w:val="false"/>
-        </w:rPr>
-        <w:t xml:space="preserve">La recuperación de contraseña (P1 #4) también se completó el 2026-07-15, con verificación E2E real y una mejora adicional de previsualizar contraseña agregada a partir de feedback directo del usuario — ver sección dedicada.</w:t>
-      </w:r>
-    </w:p>
-    <w:p>
-      <w:pPr>
-        <w:spacing w:after="120"/>
-      </w:pPr>
-      <w:r>
-        <w:rPr>
-          <w:b w:val="false"/>
-          <w:bCs w:val="false"/>
-          <w:i w:val="false"/>
-          <w:iCs w:val="false"/>
-        </w:rPr>
-        <w:t xml:space="preserve">Durante la revisión posterior a la verificación E2E surgieron dos frentes nuevos de trabajo, separados del CRUD original:</w:t>
+        <w:t xml:space="preserve">Estado al 2026-07-16: TODAS las tareas P0 y P1 numeradas están completadas (#4 recuperación de contraseña, #5 UX de confirmación, #6 invitaciones multiusuario, #7 adjuntos en Storage, #8 auditoría RLS). También se completó la pieza B de arquitectura (exportar/importar pacientes), con un diseño distinto al planeado originalmente. Quedan: la tanda de edición de interfaz (P1.5, Sonnet), las tareas P2, y la pieza A de arquitectura (directorio público auditado, Fable).</w:t>
       </w:r>
     </w:p>
     <w:p>
@@ -114,7 +86,7 @@
         <w:spacing w:after="80"/>
       </w:pPr>
       <w:r>
-        <w:t xml:space="preserve">Un conjunto extenso de ajustes de interfaz y experiencia de usuario, acotados y mecánicos — candidatos a Sonnet.</w:t>
+        <w:t xml:space="preserve">Frente restante principal: ajustes de interfaz y experiencia de usuario (P1.5), acotados y mecánicos — Sonnet.</w:t>
       </w:r>
     </w:p>
     <w:p>
@@ -127,7 +99,7 @@
         <w:spacing w:after="80"/>
       </w:pPr>
       <w:r>
-        <w:t xml:space="preserve">Dos piezas de arquitectura nueva (directorio público auditado y exportación/importación de pacientes entre households), que tocan RLS y esquema de datos de forma sustancial — candidatas a Fable, pendientes de diseño detallado.</w:t>
+        <w:t xml:space="preserve">Arquitectura restante: pieza A, directorio público auditado de médicos y centros — Fable, pendiente de diseño detallado.</w:t>
       </w:r>
     </w:p>
     <w:p>
@@ -1015,7 +987,7 @@
         <w:spacing w:after="150" w:before="300"/>
       </w:pPr>
       <w:r>
-        <w:t xml:space="preserve">Prioridad P1 — Core faltante (sin cambios respecto al plan original, salvo P1 #4)</w:t>
+        <w:t xml:space="preserve">Prioridad P1 — Core faltante (COMPLETA al 2026-07-16)</w:t>
       </w:r>
     </w:p>
     <w:tbl>
@@ -1277,15 +1249,16 @@
         <w:tc>
           <w:tcPr>
             <w:tcW w:type="dxa" w:w="5200"/>
-            <w:vAlign w:val="center"/>
-          </w:tcPr>
-          <w:p>
-            <w:r>
-              <w:rPr>
-                <w:b w:val="false"/>
-                <w:bCs w:val="false"/>
-              </w:rPr>
-              <w:t xml:space="preserve">Toca RLS y modelo de invitaciones.</w:t>
+            <w:shd w:fill="E2EFDA" w:val="clear"/>
+            <w:vAlign w:val="center"/>
+          </w:tcPr>
+          <w:p>
+            <w:r>
+              <w:rPr>
+                <w:b w:val="false"/>
+                <w:bCs w:val="false"/>
+              </w:rPr>
+              <w:t xml:space="preserve">✅ Completada el 2026-07-15 y verificada E2E en producción (ciclo completo: generar código → canjear → salir). Migración 0005 + vista Familia. Ver sección dedicada.</w:t>
             </w:r>
           </w:p>
         </w:tc>
@@ -1339,15 +1312,16 @@
         <w:tc>
           <w:tcPr>
             <w:tcW w:type="dxa" w:w="5200"/>
-            <w:vAlign w:val="center"/>
-          </w:tcPr>
-          <w:p>
-            <w:r>
-              <w:rPr>
-                <w:b w:val="false"/>
-                <w:bCs w:val="false"/>
-              </w:rPr>
-              <w:t xml:space="preserve">Migración de datos existentes + políticas de Storage por household. Diseño conversado en la sesión del 2026-07-11, pendiente de ejecución.</w:t>
+            <w:shd w:fill="E2EFDA" w:val="clear"/>
+            <w:vAlign w:val="center"/>
+          </w:tcPr>
+          <w:p>
+            <w:r>
+              <w:rPr>
+                <w:b w:val="false"/>
+                <w:bCs w:val="false"/>
+              </w:rPr>
+              <w:t xml:space="preserve">✅ Completada el 2026-07-15 (migración 0006, bucket privado con políticas por household). Producción tenía 0 adjuntos base64 — no hubo datos que mover. Pendiente E2E por UI. Ver sección dedicada.</w:t>
             </w:r>
           </w:p>
         </w:tc>
@@ -1401,20 +1375,136 @@
         <w:tc>
           <w:tcPr>
             <w:tcW w:type="dxa" w:w="5200"/>
-            <w:vAlign w:val="center"/>
-          </w:tcPr>
-          <w:p>
-            <w:r>
-              <w:rPr>
-                <w:b w:val="false"/>
-                <w:bCs w:val="false"/>
-              </w:rPr>
-              <w:t xml:space="preserve">Datos de salud públicos; el WARN de is_household_member() sigue vigente tras la migración 0004 — confirmado por los advisors de seguridad en el E2E del 2026-07-15. Punto de partida concreto para esta auditoría.</w:t>
+            <w:shd w:fill="E2EFDA" w:val="clear"/>
+            <w:vAlign w:val="center"/>
+          </w:tcPr>
+          <w:p>
+            <w:r>
+              <w:rPr>
+                <w:b w:val="false"/>
+                <w:bCs w:val="false"/>
+              </w:rPr>
+              <w:t xml:space="preserve">✅ Completada el 2026-07-16 (migraciones 0007 y 0008): WARN de is_household_member resuelto, FKs compuestas multi-tenant, created_by inmutable, anon sin acceso. Ver sección dedicada.</w:t>
             </w:r>
           </w:p>
         </w:tc>
       </w:tr>
     </w:tbl>
+    <w:p>
+      <w:pPr>
+        <w:pStyle w:val="Heading1"/>
+        <w:spacing w:after="150" w:before="300"/>
+      </w:pPr>
+      <w:r>
+        <w:t xml:space="preserve">Resultados de la sesión del 2026-07-15/16 (P1 #6, #7, #8 y pieza B)</w:t>
+      </w:r>
+    </w:p>
+    <w:p>
+      <w:pPr>
+        <w:pStyle w:val="Heading2"/>
+        <w:spacing w:after="120" w:before="240"/>
+      </w:pPr>
+      <w:r>
+        <w:t xml:space="preserve">Invitaciones al household (P1 #6) — multiusuario real</w:t>
+      </w:r>
+    </w:p>
+    <w:p>
+      <w:pPr>
+        <w:spacing w:after="120"/>
+      </w:pPr>
+      <w:r>
+        <w:rPr>
+          <w:b w:val="false"/>
+          <w:bCs w:val="false"/>
+          <w:i w:val="false"/>
+          <w:iCs w:val="false"/>
+        </w:rPr>
+        <w:t xml:space="preserve">Varias cuentas (cada una con su login propio) comparten el mismo household. El owner genera un código de invitación desde la nueva vista Familia y lo comparte por donde quiera; el invitado crea su cuenta normal y lo canjea. Un solo uso, caduca a los 7 días, revocable. El código nunca se guarda en claro (solo hash sha256). Al canjear, el household vacío del invitado se elimina (modelo de un household por usuario); si tiene datos u otros miembros, el canje se bloquea sin quemar el código. El owner saca miembros pero no puede borrarse a sí mismo; un member puede salir por su cuenta. Verificada con 19 casos de seguridad (JWT simulado + rollback) y E2E real en producción con el ciclo completo.</w:t>
+      </w:r>
+    </w:p>
+    <w:p>
+      <w:pPr>
+        <w:pStyle w:val="Heading2"/>
+        <w:spacing w:after="120" w:before="240"/>
+      </w:pPr>
+      <w:r>
+        <w:t xml:space="preserve">Exportar / Importar pacientes (pieza B) — diseño cambiado</w:t>
+      </w:r>
+    </w:p>
+    <w:p>
+      <w:pPr>
+        <w:spacing w:after="120"/>
+      </w:pPr>
+      <w:r>
+        <w:rPr>
+          <w:b w:val="false"/>
+          <w:bCs w:val="false"/>
+          <w:i w:val="false"/>
+          <w:iCs w:val="false"/>
+        </w:rPr>
+        <w:t xml:space="preserve">Se implementó con un diseño DISTINTO al planeado (llave en el servidor): archivo cifrado que se descarga al dispositivo (.sfam). El servidor nunca ve el contenido ni la contraseña; sin cambios de esquema ni RLS. Exportar: selección de pacientes + contraseña propia del archivo (dos veces, mín. 8) → AES-256-GCM con clave derivada por PBKDF2 (310k iteraciones) en el navegador; incluye órdenes, medicamentos, vitales, adjuntos embebidos y los médicos/centros referenciados. Importar: archivo + contraseña → resumen → confirmación → todo se crea en la familia actual con IDs remapeados. En el flujo 'Unirse a otra familia' con datos, una ventana ofrece exportar primero y explica los pasos (sin borrado masivo automático, por decisión del usuario). Verificada por el usuario en producción.</w:t>
+      </w:r>
+    </w:p>
+    <w:p>
+      <w:pPr>
+        <w:pStyle w:val="Heading2"/>
+        <w:spacing w:after="120" w:before="240"/>
+      </w:pPr>
+      <w:r>
+        <w:t xml:space="preserve">Adjuntos en Supabase Storage (P1 #7)</w:t>
+      </w:r>
+    </w:p>
+    <w:p>
+      <w:pPr>
+        <w:spacing w:after="120"/>
+      </w:pPr>
+      <w:r>
+        <w:rPr>
+          <w:b w:val="false"/>
+          <w:bCs w:val="false"/>
+          <w:i w:val="false"/>
+          <w:iCs w:val="false"/>
+        </w:rPr>
+        <w:t xml:space="preserve">Los archivos de las órdenes dejaron de guardarse como base64 dentro de jsonb: van a un bucket privado ('adjuntos', máx. 10MB, imágenes y PDF) con rutas &lt;household&gt;/&lt;orden&gt;/&lt;archivo&gt; y políticas de Storage que reutilizan is_household_member() — mismo aislamiento por familia, probado con JWT simulado. El formato viejo se sigue leyendo; editar una orden o importar un .sfam viejo migra esos adjuntos automáticamente. Miniaturas y apertura con URLs firmadas; limpieza del bucket al reemplazar/quitar/eliminar. Producción tenía 0 adjuntos base64, así que no hubo migración de datos. Pendiente: E2E corto por UI (subir, ver, reemplazar, eliminar).</w:t>
+      </w:r>
+    </w:p>
+    <w:p>
+      <w:pPr>
+        <w:pStyle w:val="Heading2"/>
+        <w:spacing w:after="120" w:before="240"/>
+      </w:pPr>
+      <w:r>
+        <w:t xml:space="preserve">Auditoría de seguridad RLS pre-lanzamiento (P1 #8)</w:t>
+      </w:r>
+    </w:p>
+    <w:p>
+      <w:pPr>
+        <w:spacing w:after="120"/>
+      </w:pPr>
+      <w:r>
+        <w:rPr>
+          <w:b w:val="false"/>
+          <w:bCs w:val="false"/>
+          <w:i w:val="false"/>
+          <w:iCs w:val="false"/>
+        </w:rPr>
+        <w:t xml:space="preserve">Hallazgos corregidos (migración 0007): (1) is_household_member() movida al schema 'private', fuera del API expuesto — desaparece el WARN que motivó la auditoría; (2) FKs compuestas (columna, household_id) impiden referenciar pacientes/médicos/centros de otra familia — antes era posible (sin fuga de lectura, pero con contaminación referencial); (3) households.created_by era reasignable y otorga visibilidad permanente — ahora solo 'name' es actualizable; (4) revocados los grants de escritura sin política que los respalde y TODO acceso de anon. La migración 0008 alinea los índices a las FKs compuestas. Matriz completa de pruebas: 12 casos cross-tenant + bloqueos nuevos + canje intacto + regresión de flujos normales (incluido el camino del bug 403 histórico) — todas pasan.</w:t>
+      </w:r>
+    </w:p>
+    <w:p>
+      <w:pPr>
+        <w:spacing w:after="120"/>
+      </w:pPr>
+      <w:r>
+        <w:rPr>
+          <w:b w:val="false"/>
+          <w:bCs w:val="false"/>
+          <w:i w:val="false"/>
+          <w:iCs w:val="false"/>
+        </w:rPr>
+        <w:t xml:space="preserve">Aceptado y documentado: las 3 RPC SECURITY DEFINER del sistema de invitaciones son intencionales (son la API, con autorización interna probada). 'Leaked password protection' requiere plan Pro — la API lo rechaza en el gratuito; como mitigación, el mínimo de contraseña subió a 8 caracteres en Auth y en el cliente.</w:t>
+      </w:r>
+    </w:p>
     <w:p>
       <w:pPr>
         <w:pStyle w:val="Heading1"/>
@@ -3436,7 +3526,7 @@
         <w:spacing w:after="150" w:before="300"/>
       </w:pPr>
       <w:r>
-        <w:t xml:space="preserve">Arquitectura futura — pendiente de diseño con agente de mayor capacidad (Fable)</w:t>
+        <w:t xml:space="preserve">Arquitectura futura — estado al 2026-07-16</w:t>
       </w:r>
     </w:p>
     <w:p>
@@ -3450,7 +3540,7 @@
           <w:i w:val="false"/>
           <w:iCs w:val="false"/>
         </w:rPr>
-        <w:t xml:space="preserve">Dos piezas nuevas, conversadas a nivel de diseño pero deliberadamente NO implementadas todavía, dado que ambas tocan RLS y/o mueven datos médicos entre households — exactamente el tipo de cambio que el criterio propio del proyecto reserva para el máximo nivel de cuidado.</w:t>
+        <w:t xml:space="preserve">De las dos piezas originales, la B (exportar/importar pacientes) YA SE IMPLEMENTÓ con un diseño distinto al conversado — ver la sección de resultados más arriba. Queda pendiente solo la pieza A. El texto original de ambas se conserva a continuación como referencia del diseño conversado.</w:t>
       </w:r>
     </w:p>
     <w:p>
@@ -3548,7 +3638,7 @@
         <w:spacing w:after="120" w:before="240"/>
       </w:pPr>
       <w:r>
-        <w:t xml:space="preserve">B. Exportar / Importar pacientes entre households</w:t>
+        <w:t xml:space="preserve">B. Exportar / Importar pacientes entre households — ✅ COMPLETADA (diseño final distinto)</w:t>
       </w:r>
     </w:p>
     <w:p>
@@ -3559,24 +3649,10 @@
         <w:rPr>
           <w:b w:val="false"/>
           <w:bCs w:val="false"/>
-          <w:i w:val="false"/>
-          <w:iCs w:val="false"/>
+          <w:i/>
+          <w:iCs/>
         </w:rPr>
-        <w:t xml:space="preserve">Permite mover la información completa de un paciente (datos personales, pólizas, órdenes médicas, medicamentos, signos vitales, adjuntos) hacia un household distinto de aquel en el que fue creado, cuando sea necesario.</w:t>
-      </w:r>
-    </w:p>
-    <w:p>
-      <w:pPr>
-        <w:spacing w:after="120"/>
-      </w:pPr>
-      <w:r>
-        <w:rPr>
-          <w:b w:val="false"/>
-          <w:bCs w:val="false"/>
-          <w:i w:val="false"/>
-          <w:iCs w:val="false"/>
-        </w:rPr>
-        <w:t xml:space="preserve">Diseño acordado:</w:t>
+        <w:t xml:space="preserve">Implementada el 2026-07-15 como archivo cifrado descargable (.sfam) en vez de llave en el servidor — ver sección de resultados. El diseño original conversado era:</w:t>
       </w:r>
     </w:p>
     <w:p>
@@ -3705,7 +3781,7 @@
                 <w:b w:val="false"/>
                 <w:bCs w:val="false"/>
               </w:rPr>
-              <w:t xml:space="preserve">Todo lo que toque seguridad RLS y migraciones de datos — errores ahí son irreversibles o pueden filtrar datos médicos entre familias. Incluye: invitar miembros al household, migración a Supabase Storage, auditoría RLS pre-lanzamiento (partiendo del WARN de is_household_member confirmado en el E2E), directorio público auditado, y exportar/importar pacientes.</w:t>
+              <w:t xml:space="preserve">Todo lo que toque seguridad RLS y migraciones de datos — errores ahí son irreversibles o pueden filtrar datos médicos entre familias. Ya ejecutó: invitaciones (P1 #6), exportar/importar (pieza B), Storage (P1 #7) y auditoría RLS (P1 #8). Del plan actual le queda solo la pieza A (directorio público auditado) y cualquier cambio futuro de RLS/esquema.</w:t>
             </w:r>
           </w:p>
         </w:tc>
@@ -3769,7 +3845,7 @@
                 <w:b w:val="false"/>
                 <w:bCs w:val="false"/>
               </w:rPr>
-              <w:t xml:space="preserve">Tareas acotadas y mecánicas: configuración, UI, limpieza, contenido. Incluye toda la sección de edición de interfaz de este documento.</w:t>
+              <w:t xml:space="preserve">Tareas acotadas y mecánicas: configuración, UI, limpieza, contenido. Incluye toda la sección de edición de interfaz de este documento (el frente grande restante) y las tareas P2.</w:t>
             </w:r>
           </w:p>
         </w:tc>
@@ -3868,7 +3944,7 @@
         <w:spacing w:after="80"/>
       </w:pPr>
       <w:r>
-        <w:t xml:space="preserve">Ejecutar la sección de edición de interfaz (P1.5) con Sonnet, módulo por módulo, empezando por el patrón transversal 'Otra extensible' y el de imágenes ampliables, ya que se repiten en varios módulos.</w:t>
+        <w:t xml:space="preserve">E2E corto de adjuntos en producción: subir un PDF o foto a una orden, verlo con el clic en el nombre, reemplazarlo y eliminar la orden (verifica también la limpieza del bucket).</w:t>
       </w:r>
     </w:p>
     <w:p>
@@ -3881,7 +3957,7 @@
         <w:spacing w:after="80"/>
       </w:pPr>
       <w:r>
-        <w:t xml:space="preserve">Reservar una sesión con Fable para la auditoría de seguridad RLS pre-lanzamiento (P1 #8), partiendo del WARN de is_household_member confirmado en el E2E, y para el diseño detallado de exportar/importar pacientes y del directorio público auditado.</w:t>
+        <w:t xml:space="preserve">Ejecutar la sección de edición de interfaz (P1.5) con Sonnet, módulo por módulo, empezando por el patrón transversal 'Otra extensible' y el de imágenes ampliables, ya que se repiten en varios módulos.</w:t>
       </w:r>
     </w:p>
     <w:p>
@@ -3894,7 +3970,33 @@
         <w:spacing w:after="80"/>
       </w:pPr>
       <w:r>
-        <w:t xml:space="preserve">Decidir qué hacer con los datos de prueba conservados en producción tras el E2E (dejarlos como muestra o limpiarlos antes del lanzamiento real).</w:t>
+        <w:t xml:space="preserve">Diseño detallado de la pieza A (directorio público auditado) con Fable, cuando se decida priorizarla.</w:t>
+      </w:r>
+    </w:p>
+    <w:p>
+      <w:pPr>
+        <w:pStyle w:val="ListParagraph"/>
+        <w:numPr>
+          <w:ilvl w:val="0"/>
+          <w:numId w:val="1"/>
+        </w:numPr>
+        <w:spacing w:after="80"/>
+      </w:pPr>
+      <w:r>
+        <w:t xml:space="preserve">Decidir qué hacer con los datos de prueba conservados en producción tras los E2E (dejarlos como muestra o limpiarlos antes del lanzamiento real).</w:t>
+      </w:r>
+    </w:p>
+    <w:p>
+      <w:pPr>
+        <w:pStyle w:val="ListParagraph"/>
+        <w:numPr>
+          <w:ilvl w:val="0"/>
+          <w:numId w:val="1"/>
+        </w:numPr>
+        <w:spacing w:after="80"/>
+      </w:pPr>
+      <w:r>
+        <w:t xml:space="preserve">Si algún día se pasa al plan Pro de Supabase: activar 'Leaked password protection' (HaveIBeenPwned) en Auth — quedó rechazado por la API en el plan gratuito; el mínimo de contraseña ya se subió a 8.</w:t>
       </w:r>
     </w:p>
     <w:sectPr>

</xml_diff>

<commit_message>
Actualizar CONTEXTO.md y plan de avance con el trabajo P1.5 de esta sesión
Documenta Órdenes médicas, Medicamentos, Médicos e imágenes/documentos
transversal como completados y verificados E2E, el helper compartido
extensibleCatalog.js, las migraciones 0009-0011, el bug crítico de
dataUrlToBlob/jsPDF encontrado y corregido, y el estado real de los
datos de prueba en producción tras el E2E de esta tanda.

Co-Authored-By: Claude Sonnet 5 <noreply@anthropic.com>
Claude-Session: https://claude.ai/code/session_017FAQsY25q3v9jND2W6jZA5
</commit_message>
<xml_diff>
--- a/docs/Plan_de_Avance_MVP.docx
+++ b/docs/Plan_de_Avance_MVP.docx
@@ -36,7 +36,7 @@
           <w:i/>
           <w:iCs/>
         </w:rPr>
-        <w:t xml:space="preserve">Actualizado el 2026-07-16 · Versión unificada (plan original + verificación E2E en producción + recuperación de contraseña + invitaciones al household + exportar/importar pacientes + adjuntos en Storage + auditoría de seguridad RLS)</w:t>
+        <w:t>Actualizado el 2026-07-16 · Versión unificada (plan original + verificación E2E en producción + recuperación de contraseña + invitaciones al household + exportar/importar pacientes + adjuntos en Storage + auditoría de seguridad RLS + P1.5: Órdenes médicas, Medicamentos, Médicos e imágenes/documentos transversal)</w:t>
       </w:r>
     </w:p>
     <w:p>
@@ -73,7 +73,7 @@
           <w:i w:val="false"/>
           <w:iCs w:val="false"/>
         </w:rPr>
-        <w:t xml:space="preserve">Estado al 2026-07-16: TODAS las tareas P0 y P1 numeradas están completadas (#4 recuperación de contraseña, #5 UX de confirmación, #6 invitaciones multiusuario, #7 adjuntos en Storage, #8 auditoría RLS). También se completó la pieza B de arquitectura (exportar/importar pacientes), con un diseño distinto al planeado originalmente. Quedan: la tanda de edición de interfaz (P1.5, Sonnet), las tareas P2, y la pieza A de arquitectura (directorio público auditado, Fable).</w:t>
+        <w:t>Estado al 2026-07-16: TODAS las tareas P0 y P1 numeradas están completadas (#4 recuperación de contraseña, #5 UX de confirmación, #6 invitaciones multiusuario, #7 adjuntos en Storage, #8 auditoría RLS). También se completó la pieza B de arquitectura (exportar/importar pacientes), con un diseño distinto al planeado originalmente. De la tanda P1.5 (edición de interfaz) ya se completaron: tema visual, Ficha de paciente, Órdenes médicas, Medicamentos, Médicos, y el cambio transversal de imágenes/documentos (foto→PDF + captura por cámara) — con un bug crítico de producción encontrado y corregido en el camino. Quedan de P1.5: el componente de ampliar/descargar imágenes (lightbox, aún no implementado) y, opcionalmente, migrar Pólizas al helper compartido del patrón "Otra". Fuera de P1.5 quedan las tareas P2 y la pieza A de arquitectura (directorio público auditado, Fable).</w:t>
       </w:r>
     </w:p>
     <w:p>
@@ -2490,6 +2490,14 @@
       </w:tr>
     </w:tbl>
     <w:p>
+      <w:r>
+        <w:rPr>
+          <w:b w:val="0"/>
+        </w:rPr>
+        <w:t>✅ COMPLETADA el 2026-07-16 (commit 943dbd6): vista de solo lectura por defecto al expandir, navegación por etapas con alerta de confirmación antes de editar una etapa anterior, filtro combinado por etapa y especialidad, alta rápida de médico/centro médico sin salir del flujo, y sección "Historia clínica" (antes "Archivo PDF de la orden") que acepta fotos convertidas automáticamente a PDF. Verificada E2E en producción por el usuario.</w:t>
+      </w:r>
+    </w:p>
+    <w:p>
       <w:pPr>
         <w:pStyle w:val="Heading2"/>
         <w:spacing w:after="120" w:before="240"/>
@@ -2832,6 +2840,14 @@
       </w:tr>
     </w:tbl>
     <w:p>
+      <w:r>
+        <w:rPr>
+          <w:b w:val="0"/>
+        </w:rPr>
+        <w:t>✅ COMPLETADA el 2026-07-16 (commit 41c4211, migración 0010): "Dosis" renombrado a "Dosis diaria"; Frecuencia con las 5 opciones fijas del plan; "Horarios de toma" con hora + dosis por horario, filas auto-generadas según frecuencia, primer horario editable y siguientes recalculados automáticamente — decisión explícita del usuario: cambiar el horario base SIEMPRE recalcula todos los siguientes, incluso sobre ediciones manuales previas. Vía de administración con "Vía sonda" fija y "Otra" extensible (vía extensibleCatalog.js). Migración 0010 remapea de forma conservadora solo las frecuencias viejas con equivalencia clara.</w:t>
+      </w:r>
+    </w:p>
+    <w:p>
       <w:pPr>
         <w:pStyle w:val="Heading2"/>
         <w:spacing w:after="120" w:before="240"/>
@@ -3050,6 +3066,14 @@
       </w:tr>
     </w:tbl>
     <w:p>
+      <w:r>
+        <w:rPr>
+          <w:b w:val="0"/>
+        </w:rPr>
+        <w:t>✅ COMPLETADA el 2026-07-16 (commit 97c2115, migración 0011): Especialidad con "Otra" extensible (vía extensibleCatalog.js) y nuevo campo "Número de tarjeta profesional" debajo del nombre.</w:t>
+      </w:r>
+    </w:p>
+    <w:p>
       <w:pPr>
         <w:pStyle w:val="Heading2"/>
         <w:spacing w:after="120" w:before="240"/>
@@ -3070,6 +3094,14 @@
           <w:iCs w:val="false"/>
         </w:rPr>
         <w:t xml:space="preserve">Tres módulos distintos (Pólizas en Pacientes, Vía de administración en Medicamentos, Especialidad en Médicos) piden el mismo mecanismo: una lista desplegable con opción 'Otra' que abre un campo de texto libre y agrega la entrada al catálogo para futuras cargas. Se recomienda construir un único componente/mecanismo reutilizable para los tres casos, en vez de tres implementaciones separadas — mismo criterio de UX, menos código duplicado y mantenimiento más simple a futuro.</w:t>
+      </w:r>
+    </w:p>
+    <w:p>
+      <w:r>
+        <w:rPr>
+          <w:b w:val="0"/>
+        </w:rPr>
+        <w:t>✅ Implementado el 2026-07-16: helper compartido src/lib/extensibleCatalog.js (catalogOptionsHtml / resolveCatalogValue / OTRA_VALUE), reutilizado por Medicamentos (Vía de administración) y Médicos (Especialidad). PENDIENTE (opcional, limpieza de código, no bloqueante): Pólizas (Ficha de paciente) sigue con su propia implementación inline del mismo patrón, previa a este helper — no se migró para no arriesgar ese módulo ya verificado.</w:t>
       </w:r>
     </w:p>
     <w:p>
@@ -3178,6 +3210,33 @@
         </w:tc>
       </w:tr>
     </w:tbl>
+    <w:p>
+      <w:r>
+        <w:rPr>
+          <w:b w:val="0"/>
+        </w:rPr>
+        <w:t>PARCIAL al 2026-07-16 (commit d420668): se implementó la opción de tomar la foto directamente desde el navegador (input capture="environment") y la conversión automática de toda foto subida o tomada a PDF de una sola página, en todos los puntos de subida de archivo de la app (no solo Historia clínica) — para no acumular adjuntos pesados. PENDIENTE: el lightbox/modal para ampliar y el botón de descarga (componente reutilizable único) todavía no se construyó; ese es el ítem original de esta fila del plan.</w:t>
+      </w:r>
+    </w:p>
+    <w:p>
+      <w:pPr>
+        <w:pStyle w:val="Heading2"/>
+      </w:pPr>
+      <w:r>
+        <w:rPr>
+          <w:b w:val="0"/>
+        </w:rPr>
+        <w:t>Bug crítico de producción encontrado y corregido durante P1.5</w:t>
+      </w:r>
+    </w:p>
+    <w:p>
+      <w:r>
+        <w:rPr>
+          <w:b w:val="0"/>
+        </w:rPr>
+        <w:t>Al guardar una orden con una foto recién convertida a PDF, Supabase Storage rechazaba la subida con "mime type application/octet-stream is not supported". Causa raíz: dataUrlToBlob() en src/lib/files.js parseaba el header de la data-URL con una regex que exigía ";base64" pegado al mime type, pero el datauristring real que produce jsPDF trae un parámetro intermedio (data:application/pdf;filename=x.pdf;base64,...) que esa regex no reconocía — el Blob quedaba tipado application/octet-stream, y @supabase/storage-js usa el .type real del Blob al subir, ignorando la opción contentType cuando el payload es un Blob (confirmado leyendo su fuente). Corregido cambiando la regex a "toma todo antes del primer ; o ," (commit fb4e042). Afectaba a TODA conversión foto→PDF desde que se introdujo con Órdenes médicas — verificado con Playwright contra el formato real de jsPDF, no con un mock. Un segundo error reportado después del deploy del fix ("Failed to load module script... MIME type text/html") no era un bug de código: es el patrón clásico de chunk de Vite con nombre hasheado + rewrite SPA de Vercel tras un deploy nuevo — se resolvió con un hard refresh del navegador, sin cambios de código.</w:t>
+      </w:r>
+    </w:p>
     <w:p>
       <w:pPr>
         <w:pStyle w:val="Heading1"/>
@@ -3870,7 +3929,7 @@
         <w:spacing w:after="80"/>
       </w:pPr>
       <w:r>
-        <w:t xml:space="preserve">Supabase: proyecto smbnogsvqaowfwqchuvy (región sa-east-1), estado ACTIVE_HEALTHY. 4 migraciones aplicadas, la última (0004) corrige el bug de RLS en households.</w:t>
+        <w:t>Supabase: proyecto smbnogsvqaowfwqchuvy (región sa-east-1), estado ACTIVE_HEALTHY. 11 migraciones aplicadas (las últimas, 0009–0011, del trabajo P1.5 de esta sesión: ficha de paciente, horarios/frecuencia de medicamentos, tarjeta profesional de médicos).</w:t>
       </w:r>
     </w:p>
     <w:p>
@@ -3944,7 +4003,7 @@
         <w:spacing w:after="80"/>
       </w:pPr>
       <w:r>
-        <w:t xml:space="preserve">E2E corto de adjuntos en producción: subir un PDF o foto a una orden, verlo con el clic en el nombre, reemplazarlo y eliminar la orden (verifica también la limpieza del bucket).</w:t>
+        <w:t>Lightbox/descarga de imágenes y documentos: componente único reutilizable para ampliar y descargar cualquier adjunto de la app — es el único ítem del cambio transversal de imágenes/documentos que quedó sin implementar (ver nota en esa sección).</w:t>
       </w:r>
     </w:p>
     <w:p>
@@ -3957,7 +4016,7 @@
         <w:spacing w:after="80"/>
       </w:pPr>
       <w:r>
-        <w:t xml:space="preserve">Ejecutar la sección de edición de interfaz (P1.5) con Sonnet, módulo por módulo, empezando por el patrón transversal 'Otra extensible' y el de imágenes ampliables, ya que se repiten en varios módulos.</w:t>
+        <w:t>P1.5 completada casi en su totalidad el 2026-07-16 (tema visual, Ficha de paciente, Órdenes médicas, Medicamentos, Médicos, imágenes/documentos transversal). Opcional/pendiente: migrar Pólizas (Ficha de paciente) al helper compartido extensibleCatalog.js.</w:t>
       </w:r>
     </w:p>
     <w:p>

</xml_diff>

<commit_message>
Auditoria ficha de paciente: recorte de imagen, editar polizas/diagnosticos, fix tipo de poliza + P2 estados vacios
</commit_message>
<xml_diff>
--- a/docs/Plan_de_Avance_MVP.docx
+++ b/docs/Plan_de_Avance_MVP.docx
@@ -36,7 +36,7 @@
           <w:i/>
           <w:iCs/>
         </w:rPr>
-        <w:t>Actualizado el 2026-07-16 · Versión unificada (plan original + verificación E2E en producción + recuperación de contraseña + invitaciones al household + exportar/importar pacientes + adjuntos en Storage + auditoría de seguridad RLS + P1.5: Órdenes médicas, Medicamentos, Médicos e imágenes/documentos transversal)</w:t>
+        <w:t>Actualizado el 2026-07-16 · Versión unificada (plan original + verificación E2E en producción + recuperación de contraseña + invitaciones al household + exportar/importar pacientes + adjuntos en Storage + auditoría de seguridad RLS + P1.5 completa + P2 100% completa + backlog MI AUDITORIA de Ficha de paciente y Órdenes)</w:t>
       </w:r>
     </w:p>
     <w:p>
@@ -73,33 +73,33 @@
           <w:i w:val="false"/>
           <w:iCs w:val="false"/>
         </w:rPr>
-        <w:t>Estado al 2026-07-16: TODAS las tareas P0 y P1 numeradas están completadas (#4 recuperación de contraseña, #5 UX de confirmación, #6 invitaciones multiusuario, #7 adjuntos en Storage, #8 auditoría RLS). También se completó la pieza B de arquitectura (exportar/importar pacientes), con un diseño distinto al planeado originalmente. De la tanda P1.5 (edición de interfaz) ya se completaron: tema visual, Ficha de paciente, Órdenes médicas, Medicamentos, Médicos, y el cambio transversal de imágenes/documentos (foto→PDF + captura por cámara) — con un bug crítico de producción encontrado y corregido en el camino. Quedan de P1.5: el componente de ampliar/descargar imágenes (lightbox, aún no implementado) y, opcionalmente, migrar Pólizas al helper compartido del patrón "Otra". Fuera de P1.5 quedan las tareas P2 y la pieza A de arquitectura (directorio público auditado, Fable).</w:t>
-      </w:r>
-    </w:p>
-    <w:p>
-      <w:pPr>
-        <w:pStyle w:val="ListParagraph"/>
-        <w:numPr>
-          <w:ilvl w:val="0"/>
-          <w:numId w:val="1"/>
-        </w:numPr>
-        <w:spacing w:after="80"/>
-      </w:pPr>
-      <w:r>
-        <w:t xml:space="preserve">Frente restante principal: ajustes de interfaz y experiencia de usuario (P1.5), acotados y mecánicos — Sonnet.</w:t>
-      </w:r>
-    </w:p>
-    <w:p>
-      <w:pPr>
-        <w:pStyle w:val="ListParagraph"/>
-        <w:numPr>
-          <w:ilvl w:val="0"/>
-          <w:numId w:val="1"/>
-        </w:numPr>
-        <w:spacing w:after="80"/>
-      </w:pPr>
-      <w:r>
-        <w:t xml:space="preserve">Arquitectura restante: pieza A, directorio público auditado de médicos y centros — Fable, pendiente de diseño detallado.</w:t>
+        <w:t>Estado al 2026-07-16: TODAS las tareas P0 y P1 numeradas están completadas (#4 recuperación de contraseña, #5 UX de confirmación, #6 invitaciones multiusuario, #7 adjuntos en Storage, #8 auditoría RLS). También se completó la pieza B de arquitectura (exportar/importar pacientes), con un diseño distinto al planeado originalmente. La tanda P1.5 (edición de interfaz) está 100% completada, incluyendo los dos ítems que quedaban pendientes al cierre de la sesión anterior: el lightbox/visor de adjuntos con ampliación y descarga, y la migración de Pólizas al helper compartido del patrón "Otra". P2 también está 100% completa: responsive móvil, limpieza del HTML legacy, aviso médico/de privacidad y, como último ítem, estados vacíos y manejo de errores consistente (#11). Además, se relevó y completó un backlog adicional de la usuaria ("MI AUDITORIA"): 5 ajustes en Ficha de paciente y una restructuración de 5 partes en Órdenes médicas (ver sección dedicada más abajo). Fuera de esto queda solo la pieza A de arquitectura (directorio público auditado, Fable), sin ítems numerados pendientes del plan original.</w:t>
+      </w:r>
+    </w:p>
+    <w:p>
+      <w:pPr>
+        <w:pStyle w:val="ListParagraph"/>
+        <w:numPr>
+          <w:ilvl w:val="0"/>
+          <w:numId w:val="1"/>
+        </w:numPr>
+        <w:spacing w:after="80"/>
+      </w:pPr>
+      <w:r>
+        <w:t>Frente numerado restante: ninguno — P1, P1.5 y P2 están 100% completadas.</w:t>
+      </w:r>
+    </w:p>
+    <w:p>
+      <w:pPr>
+        <w:pStyle w:val="ListParagraph"/>
+        <w:numPr>
+          <w:ilvl w:val="0"/>
+          <w:numId w:val="1"/>
+        </w:numPr>
+        <w:spacing w:after="80"/>
+      </w:pPr>
+      <w:r>
+        <w:t>Arquitectura restante: pieza A, directorio público auditado de médicos y centros — Fable, pendiente de diseño detallado.</w:t>
       </w:r>
     </w:p>
     <w:p>
@@ -3101,7 +3101,7 @@
         <w:rPr>
           <w:b w:val="0"/>
         </w:rPr>
-        <w:t>✅ Implementado el 2026-07-16: helper compartido src/lib/extensibleCatalog.js (catalogOptionsHtml / resolveCatalogValue / OTRA_VALUE), reutilizado por Medicamentos (Vía de administración) y Médicos (Especialidad). PENDIENTE (opcional, limpieza de código, no bloqueante): Pólizas (Ficha de paciente) sigue con su propia implementación inline del mismo patrón, previa a este helper — no se migró para no arriesgar ese módulo ya verificado.</w:t>
+        <w:t>✅ Completado el 2026-07-16 (commit 6ef6bbc): las tres implementaciones del patrón "Otra… extensible" (Pólizas en Pacientes, Vía de administración en Medicamentos, Especialidad en Médicos) ahora comparten el mismo helper src/lib/extensibleCatalog.js (catalogOptionsHtml / resolveCatalogValue / OTRA_VALUE). Pólizas dejó su implementación inline propia sin cambios de comportamiento para el usuario.</w:t>
       </w:r>
     </w:p>
     <w:p>
@@ -3215,7 +3215,7 @@
         <w:rPr>
           <w:b w:val="0"/>
         </w:rPr>
-        <w:t>PARCIAL al 2026-07-16 (commit d420668): se implementó la opción de tomar la foto directamente desde el navegador (input capture="environment") y la conversión automática de toda foto subida o tomada a PDF de una sola página, en todos los puntos de subida de archivo de la app (no solo Historia clínica) — para no acumular adjuntos pesados. PENDIENTE: el lightbox/modal para ampliar y el botón de descarga (componente reutilizable único) todavía no se construyó; ese es el ítem original de esta fila del plan.</w:t>
+        <w:t>✅ Completo el 2026-07-16 (commits d420668 y db4fc95): además de tomar foto desde el navegador y convertir automáticamente a PDF, se implementó el visor de adjuntos en ventana sobrepuesta (src/lib/viewer.js) — barra superior fija con descarga y cierre, zoom 100–300% sin salir de la app, y arrastre para desplazar el documento ampliado. Reemplaza el viejo window.open a pestaña nueva en todos los módulos que suben imágenes o documentos.</w:t>
       </w:r>
     </w:p>
     <w:p>
@@ -3243,7 +3243,21 @@
         <w:spacing w:after="150" w:before="300"/>
       </w:pPr>
       <w:r>
-        <w:t xml:space="preserve">Prioridad P2 — Calidad para el público (sin cambios respecto al plan original)</w:t>
+        <w:t>Prioridad P2 — Calidad para el público (4/4 completadas)</w:t>
+      </w:r>
+    </w:p>
+    <w:p>
+      <w:pPr>
+        <w:spacing w:after="120"/>
+      </w:pPr>
+      <w:r>
+        <w:rPr>
+          <w:b w:val="false"/>
+          <w:bCs w:val="false"/>
+          <w:i w:val="false"/>
+          <w:iCs w:val="false"/>
+        </w:rPr>
+        <w:t>Las cuatro tareas numeradas quedaron completadas el 2026-07-16: responsive móvil (el sidebar quedaba oculto sin reemplazo en pantallas ≤768px; se agregó un botón de menú que abre un drawer superpuesto), eliminación de SaludFamilia.html legacy (HTML monolítico de una versión previa, no referenciado por nada), aviso médico y de privacidad (src/lib/legal.js, accesible desde login y desde una card en la app), y estados vacíos y manejo de errores consistente (#11, commit a515d18): se creó src/lib/emptyState.js como helper compartido para unificar el markup de "empty state" entre módulos y se agregó try/catch con estado de error y reintento en el render() de los ocho módulos con datos propios (Pacientes, Centros, Médicos, Medicamentos, Signos vitales, Órdenes, Dashboard, Familia), además de blindar el enrutador de main.js contra errores no capturados al cambiar de vista.</w:t>
       </w:r>
     </w:p>
     <w:tbl>
@@ -3390,6 +3404,11 @@
               <w:t xml:space="preserve">Una app de salud familiar se usa sobre todo desde el teléfono.</w:t>
             </w:r>
           </w:p>
+          <w:p>
+            <w:r>
+              <w:t>✅ Completada el 2026-07-16 (commit c9c3477): drawer de navegación en móvil con backdrop, botón de menú en el header.</w:t>
+            </w:r>
+          </w:p>
         </w:tc>
       </w:tr>
       <w:tr>
@@ -3452,6 +3471,11 @@
               <w:t xml:space="preserve">Limpieza; queda recuperable en el historial de git.</w:t>
             </w:r>
           </w:p>
+          <w:p>
+            <w:r>
+              <w:t>✅ Completada el 2026-07-16 (commit 1292cfb): HTML legacy eliminado, README actualizado con la arquitectura real.</w:t>
+            </w:r>
+          </w:p>
         </w:tc>
       </w:tr>
       <w:tr>
@@ -3514,6 +3538,11 @@
               <w:t xml:space="preserve">Homogeneizar UX en los módulos.</w:t>
             </w:r>
           </w:p>
+          <w:p>
+            <w:r>
+              <w:t>✅ Completada el 2026-07-16 (commit a515d18): helper compartido src/lib/emptyState.js + try/catch con estado de error y reintento en los ocho módulos con datos propios.</w:t>
+            </w:r>
+          </w:p>
         </w:tc>
       </w:tr>
       <w:tr>
@@ -3576,9 +3605,199 @@
               <w:t xml:space="preserve">Obligatorio al almacenar y publicar datos de salud.</w:t>
             </w:r>
           </w:p>
+          <w:p>
+            <w:r>
+              <w:t>✅ Completada el 2026-07-16 (commit d14ecbf): aviso accesible desde el login y desde una card en la app.</w:t>
+            </w:r>
+          </w:p>
         </w:tc>
       </w:tr>
     </w:tbl>
+    <w:p>
+      <w:pPr>
+        <w:pStyle w:val="Heading1"/>
+        <w:spacing w:after="150" w:before="300"/>
+      </w:pPr>
+      <w:r>
+        <w:t>MI AUDITORIA — backlog adicional de Ficha de paciente y Órdenes (completado el 2026-07-16)</w:t>
+      </w:r>
+    </w:p>
+    <w:p>
+      <w:pPr>
+        <w:spacing w:after="120"/>
+      </w:pPr>
+      <w:r>
+        <w:rPr>
+          <w:b w:val="false"/>
+          <w:bCs w:val="false"/>
+          <w:i w:val="false"/>
+          <w:iCs w:val="false"/>
+        </w:rPr>
+        <w:t>Backlog independiente del plan original y de P1.5, relevado directamente por la usuaria tras usar la app en producción ("MI AUDITORIA"). Cubre 5 ajustes puntuales en Ficha de paciente y una restructuración de 5 partes en Órdenes médicas. Se completaron y verificaron las 10 tareas en esta sesión, con tres decisiones explícitas confirmadas con el usuario antes de implementar (ver notas en cada ítem).</w:t>
+      </w:r>
+    </w:p>
+    <w:p>
+      <w:pPr>
+        <w:pStyle w:val="Heading2"/>
+        <w:spacing w:after="120" w:before="240"/>
+      </w:pPr>
+      <w:r>
+        <w:t>Pacientes (5/5 completadas)</w:t>
+      </w:r>
+    </w:p>
+    <w:p>
+      <w:pPr>
+        <w:pStyle w:val="ListParagraph"/>
+        <w:numPr>
+          <w:ilvl w:val="0"/>
+          <w:numId w:val="1"/>
+        </w:numPr>
+        <w:spacing w:after="80"/>
+      </w:pPr>
+      <w:r>
+        <w:t>#1 — Avatar del paciente: foto de perfil subida y redimensionada en el cliente antes de guardar en Storage (bucket "adjuntos"); a diferencia de los adjuntos de órdenes/pólizas, no se convierte a PDF. Migración 0012 (columna patients.foto, jsonb). Commit f31e0ac.</w:t>
+      </w:r>
+    </w:p>
+    <w:p>
+      <w:pPr>
+        <w:pStyle w:val="ListParagraph"/>
+        <w:numPr>
+          <w:ilvl w:val="0"/>
+          <w:numId w:val="1"/>
+        </w:numPr>
+        <w:spacing w:after="80"/>
+      </w:pPr>
+      <w:r>
+        <w:t>#2 — Parentesco: se agregó la opción "Pareja/Cónyuge" al desplegable de contacto de emergencia. Commit 3dd0368.</w:t>
+      </w:r>
+    </w:p>
+    <w:p>
+      <w:pPr>
+        <w:pStyle w:val="ListParagraph"/>
+        <w:numPr>
+          <w:ilvl w:val="0"/>
+          <w:numId w:val="1"/>
+        </w:numPr>
+        <w:spacing w:after="80"/>
+      </w:pPr>
+      <w:r>
+        <w:t>#3 — Pólizas: nuevo campo de texto libre "Nombre de la aseguradora" — no se modeló como catálogo extensible, es dato puntual de cada póliza, no una clasificación reutilizable. Migración 0013 (columna patient_policies.aseguradora). Commit 3dd0368.</w:t>
+      </w:r>
+    </w:p>
+    <w:p>
+      <w:pPr>
+        <w:pStyle w:val="ListParagraph"/>
+        <w:numPr>
+          <w:ilvl w:val="0"/>
+          <w:numId w:val="1"/>
+        </w:numPr>
+        <w:spacing w:after="80"/>
+      </w:pPr>
+      <w:r>
+        <w:t>#4 — Modo vista: ventana sobrepuesta de solo lectura al abrir la ficha del paciente, con barra superior fija (no se mueve al hacer scroll) y botón Editar junto a Cerrar — mismo patrón ya usado en Órdenes. Commit 2d95efa.</w:t>
+      </w:r>
+    </w:p>
+    <w:p>
+      <w:pPr>
+        <w:pStyle w:val="ListParagraph"/>
+        <w:numPr>
+          <w:ilvl w:val="0"/>
+          <w:numId w:val="1"/>
+        </w:numPr>
+        <w:spacing w:after="80"/>
+      </w:pPr>
+      <w:r>
+        <w:t>#5 — Condiciones crónicas: checkbox que habilita un desplegable "Añadir diagnóstico" en modo manual (código CIE10 ya conocido). Decisión tomada con el usuario: por ahora solo carga manual — la búsqueda por código/nombre contra el catálogo CIE10 (PDF de la OPS/PAHO) queda diferida, ya que ese documento no es consultable en vivo por código y requiere definir fuente de datos. Migración 0014 (tabla patient_diagnoses). Commit fdbd65a.</w:t>
+      </w:r>
+    </w:p>
+    <w:p>
+      <w:pPr>
+        <w:pStyle w:val="Heading2"/>
+        <w:spacing w:after="120" w:before="240"/>
+      </w:pPr>
+      <w:r>
+        <w:t>Órdenes médicas (5/5 completadas)</w:t>
+      </w:r>
+    </w:p>
+    <w:p>
+      <w:pPr>
+        <w:pStyle w:val="ListParagraph"/>
+        <w:numPr>
+          <w:ilvl w:val="0"/>
+          <w:numId w:val="1"/>
+        </w:numPr>
+        <w:spacing w:after="80"/>
+      </w:pPr>
+      <w:r>
+        <w:t>#1 — Bloqueo de eliminación: una orden solo puede eliminarse mientras sigue en la etapa A (recién creada); a partir de ahí solo es editable. Se revalida contra el servidor al momento de eliminar, no solo el botón visible en la tarjeta. Commit d385a2d.</w:t>
+      </w:r>
+    </w:p>
+    <w:p>
+      <w:pPr>
+        <w:pStyle w:val="ListParagraph"/>
+        <w:numPr>
+          <w:ilvl w:val="0"/>
+          <w:numId w:val="1"/>
+        </w:numPr>
+        <w:spacing w:after="80"/>
+      </w:pPr>
+      <w:r>
+        <w:t>#2 — Filtros expandidos: etapa, especialidad, médico y tipo de orden, todos "extensibles" — cada selector solo lista las opciones presentes entre las órdenes de la etapa actualmente filtrada — más un filtro de rango de fechas. Commit 30666f5.</w:t>
+      </w:r>
+    </w:p>
+    <w:p>
+      <w:pPr>
+        <w:pStyle w:val="ListParagraph"/>
+        <w:numPr>
+          <w:ilvl w:val="0"/>
+          <w:numId w:val="1"/>
+        </w:numPr>
+        <w:spacing w:after="80"/>
+      </w:pPr>
+      <w:r>
+        <w:t>#3 — Modo vista: mismo patrón de ventana sobrepuesta de solo lectura que Pacientes #4, con botón "Actualizar" que abre el asistente directo en la etapa pendiente. Commit 0114249.</w:t>
+      </w:r>
+    </w:p>
+    <w:p>
+      <w:pPr>
+        <w:pStyle w:val="ListParagraph"/>
+        <w:numPr>
+          <w:ilvl w:val="0"/>
+          <w:numId w:val="1"/>
+        </w:numPr>
+        <w:spacing w:after="80"/>
+      </w:pPr>
+      <w:r>
+        <w:t>#4 — Restructuración de tipo de orden: se elimina "Insumos Médicos" y "Medicamentos" pasa a llamarse "Medicamentos/Insumos/Terapias" (las órdenes existentes de ambos tipos se migraron automáticamente, sin pérdida de datos — verificado contra producción antes de aplicar). Este tipo reemplaza la etapa "Autorización" (un registro) por "Autorizaciones": se declara un número de meses y se genera una fila por mes (número de autorización, fecha de inicio, fecha de vencimiento, cantidad, entregado) en la nueva tabla order_authorizations. Nunca pasa por la etapa Cita — queda bloqueada en la UI — y se finaliza con un botón manual. "Centro Médico" se renombra a "Proveedor" en este flujo (mismo directorio). Dos decisiones tomadas con el usuario: una fila por mes (no un dato meramente informativo) y botón manual de finalizado (no automático, ya que este tipo no pasa por Cita). Migración 0015 (columna medical_orders.auth_meses, tabla order_authorizations, ajuste de la función order_stage()). Commit 67e7672.</w:t>
+      </w:r>
+    </w:p>
+    <w:p>
+      <w:pPr>
+        <w:pStyle w:val="ListParagraph"/>
+        <w:numPr>
+          <w:ilvl w:val="0"/>
+          <w:numId w:val="1"/>
+        </w:numPr>
+        <w:spacing w:after="80"/>
+      </w:pPr>
+      <w:r>
+        <w:t>#5 — Pestaña Flujo: nueva vista de línea de tiempo junto a "Lista", que agrupa en un bloque las órdenes del mismo día + mismo médico tratante (mismo médico implica misma especialidad); en colapsado muestra solo especialidad y fecha, y al expandir muestra el médico y el detalle completo de lo ordenado ese día, con acceso directo a cada orden. Commit 927cbd9.</w:t>
+      </w:r>
+    </w:p>
+    <w:p>
+      <w:pPr>
+        <w:spacing w:after="120"/>
+      </w:pPr>
+      <w:r>
+        <w:rPr>
+          <w:b w:val="false"/>
+          <w:bCs w:val="false"/>
+          <w:i w:val="false"/>
+          <w:iCs w:val="false"/>
+        </w:rPr>
+        <w:t>Verificación: cada ítem se probó con Playwright reconstruyendo el HTML real de los componentes (varios no están exportados y requieren una sesión autenticada) para no escribir datos de prueba en el proyecto de Supabase de producción; la migración 0015 se verificó además contra los datos reales antes de aplicarse (solo 4 órdenes existentes, ninguna con datos de cita/autorización ya cargados — fusión sin pérdida confirmada por SQL). Los 10 commits se entregaron por bundles de git (sin conector de GitHub disponible en este entorno) y ya están fusionados en origin/main.</w:t>
+      </w:r>
+    </w:p>
     <w:p>
       <w:pPr>
         <w:pStyle w:val="Heading1"/>
@@ -3929,7 +4148,7 @@
         <w:spacing w:after="80"/>
       </w:pPr>
       <w:r>
-        <w:t>Supabase: proyecto smbnogsvqaowfwqchuvy (región sa-east-1), estado ACTIVE_HEALTHY. 11 migraciones aplicadas (las últimas, 0009–0011, del trabajo P1.5 de esta sesión: ficha de paciente, horarios/frecuencia de medicamentos, tarjeta profesional de médicos).</w:t>
+        <w:t>Supabase: proyecto smbnogsvqaowfwqchuvy (región sa-east-1), estado ACTIVE_HEALTHY. 15 migraciones aplicadas (0012–0015 del backlog MI AUDITORIA: avatar de paciente, aseguradora de pólizas, diagnósticos crónicos CIE10, y autorizaciones mes a mes de Órdenes).</w:t>
       </w:r>
     </w:p>
     <w:p>
@@ -4003,46 +4222,46 @@
         <w:spacing w:after="80"/>
       </w:pPr>
       <w:r>
-        <w:t>Lightbox/descarga de imágenes y documentos: componente único reutilizable para ampliar y descargar cualquier adjunto de la app — es el único ítem del cambio transversal de imágenes/documentos que quedó sin implementar (ver nota en esa sección).</w:t>
-      </w:r>
-    </w:p>
-    <w:p>
-      <w:pPr>
-        <w:pStyle w:val="ListParagraph"/>
-        <w:numPr>
-          <w:ilvl w:val="0"/>
-          <w:numId w:val="1"/>
-        </w:numPr>
-        <w:spacing w:after="80"/>
-      </w:pPr>
-      <w:r>
-        <w:t>P1.5 completada casi en su totalidad el 2026-07-16 (tema visual, Ficha de paciente, Órdenes médicas, Medicamentos, Médicos, imágenes/documentos transversal). Opcional/pendiente: migrar Pólizas (Ficha de paciente) al helper compartido extensibleCatalog.js.</w:t>
-      </w:r>
-    </w:p>
-    <w:p>
-      <w:pPr>
-        <w:pStyle w:val="ListParagraph"/>
-        <w:numPr>
-          <w:ilvl w:val="0"/>
-          <w:numId w:val="1"/>
-        </w:numPr>
-        <w:spacing w:after="80"/>
-      </w:pPr>
-      <w:r>
-        <w:t xml:space="preserve">Diseño detallado de la pieza A (directorio público auditado) con Fable, cuando se decida priorizarla.</w:t>
-      </w:r>
-    </w:p>
-    <w:p>
-      <w:pPr>
-        <w:pStyle w:val="ListParagraph"/>
-        <w:numPr>
-          <w:ilvl w:val="0"/>
-          <w:numId w:val="1"/>
-        </w:numPr>
-        <w:spacing w:after="80"/>
-      </w:pPr>
-      <w:r>
-        <w:t xml:space="preserve">Decidir qué hacer con los datos de prueba conservados en producción tras los E2E (dejarlos como muestra o limpiarlos antes del lanzamiento real).</w:t>
+        <w:t>P2 #11 — Estados vacíos y manejo de errores consistente: ✅ COMPLETADA el 2026-07-16 (ver sección dedicada de Prioridad P2). No queda ningún ítem numerado pendiente del plan original.</w:t>
+      </w:r>
+    </w:p>
+    <w:p>
+      <w:pPr>
+        <w:pStyle w:val="ListParagraph"/>
+        <w:numPr>
+          <w:ilvl w:val="0"/>
+          <w:numId w:val="1"/>
+        </w:numPr>
+        <w:spacing w:after="80"/>
+      </w:pPr>
+      <w:r>
+        <w:t>Diseño detallado de la pieza A (directorio público auditado) con Fable, cuando se decida priorizarla.</w:t>
+      </w:r>
+    </w:p>
+    <w:p>
+      <w:pPr>
+        <w:pStyle w:val="ListParagraph"/>
+        <w:numPr>
+          <w:ilvl w:val="0"/>
+          <w:numId w:val="1"/>
+        </w:numPr>
+        <w:spacing w:after="80"/>
+      </w:pPr>
+      <w:r>
+        <w:t>Decidir qué hacer con los datos de prueba conservados en producción tras los E2E (dejarlos como muestra o limpiarlos antes del lanzamiento real).</w:t>
+      </w:r>
+    </w:p>
+    <w:p>
+      <w:pPr>
+        <w:pStyle w:val="ListParagraph"/>
+        <w:numPr>
+          <w:ilvl w:val="0"/>
+          <w:numId w:val="1"/>
+        </w:numPr>
+        <w:spacing w:after="80"/>
+      </w:pPr>
+      <w:r>
+        <w:t>Si algún día se pasa al plan Pro de Supabase: activar "Leaked password protection" (HaveIBeenPwned) en Auth — quedó rechazado por la API en el plan gratuito; el mínimo de contraseña ya se subió a 8.</w:t>
       </w:r>
     </w:p>
     <w:p>

</xml_diff>

<commit_message>
Consolidar CONTEXTO.md y Plan de Avance MVP con el cierre de esta tanda
</commit_message>
<xml_diff>
--- a/docs/Plan_de_Avance_MVP.docx
+++ b/docs/Plan_de_Avance_MVP.docx
@@ -36,7 +36,7 @@
           <w:i/>
           <w:iCs/>
         </w:rPr>
-        <w:t>Actualizado el 2026-07-16 · Versión unificada (plan original + verificación E2E en producción + recuperación de contraseña + invitaciones al household + exportar/importar pacientes + adjuntos en Storage + auditoría de seguridad RLS + P1.5 completa + P2 100% completa + backlog MI AUDITORIA de Ficha de paciente y Órdenes)</w:t>
+        <w:t>Actualizado el 2026-07-17 · Versión unificada (plan original + verificación E2E en producción + recuperación de contraseña + invitaciones al household + exportar/importar + Storage + auditoría RLS + P1.5 + P2 + MI AUDITORIA + segunda auditoría de Ficha de paciente + tercera auditoría de Medicamentos + cuarta auditoría de Signos Vitales (incl. perímetro cefálico) + cierre de esta tanda: reinicio de datos de prueba y verificación final de despliegue)</w:t>
       </w:r>
     </w:p>
     <w:p>
@@ -73,7 +73,7 @@
           <w:i w:val="false"/>
           <w:iCs w:val="false"/>
         </w:rPr>
-        <w:t>Estado al 2026-07-16: TODAS las tareas P0 y P1 numeradas están completadas (#4 recuperación de contraseña, #5 UX de confirmación, #6 invitaciones multiusuario, #7 adjuntos en Storage, #8 auditoría RLS). También se completó la pieza B de arquitectura (exportar/importar pacientes), con un diseño distinto al planeado originalmente. La tanda P1.5 (edición de interfaz) está 100% completada, incluyendo los dos ítems que quedaban pendientes al cierre de la sesión anterior: el lightbox/visor de adjuntos con ampliación y descarga, y la migración de Pólizas al helper compartido del patrón "Otra". P2 también está 100% completa: responsive móvil, limpieza del HTML legacy, aviso médico/de privacidad y, como último ítem, estados vacíos y manejo de errores consistente (#11). Además, se relevó y completó un backlog adicional de la usuaria ("MI AUDITORIA"): 5 ajustes en Ficha de paciente y una restructuración de 5 partes en Órdenes médicas (ver sección dedicada más abajo). Fuera de esto queda solo la pieza A de arquitectura (directorio público auditado, Fable), sin ítems numerados pendientes del plan original.</w:t>
+        <w:t>Estado al 2026-07-17: TODAS las tareas P0 y P1 numeradas están completadas (#4 recuperación de contraseña, #5 UX de confirmación, #6 invitaciones al household, #7 adjuntos en Storage, #8 auditoría RLS), P1.5 y P2 están 100% completadas, y el backlog adicional relevado por la usuaria fuera del plan original — MI AUDITORIA, la segunda auditoría de Ficha de paciente, la tercera auditoría de Medicamentos y la cuarta auditoría de Signos Vitales (con perímetro cefálico) — también está completo y confirmado en línea en producción. Además, se reinició deliberadamente la base de datos de producción (datos clínicos de las 3 cuentas, con auth/households/membresías preservados) para dejarla lista para uso real.</w:t>
       </w:r>
     </w:p>
     <w:p>
@@ -788,59 +788,59 @@
           <w:i w:val="false"/>
           <w:iCs w:val="false"/>
         </w:rPr>
-        <w:t xml:space="preserve">La base de datos de producción ya NO está vacía. Se conservaron deliberadamente los datos de prueba generados durante el E2E:</w:t>
-      </w:r>
-    </w:p>
-    <w:p>
-      <w:pPr>
-        <w:pStyle w:val="ListParagraph"/>
-        <w:numPr>
-          <w:ilvl w:val="0"/>
-          <w:numId w:val="1"/>
-        </w:numPr>
-        <w:spacing w:after="80"/>
-      </w:pPr>
-      <w:r>
-        <w:t xml:space="preserve">auth.users: 2 — alnp.alnp@gmail.com (cuenta del E2E, con el set completo de datos de muestra) y dacn.2026@gmail.com (household propio, sin pacientes).</w:t>
-      </w:r>
-    </w:p>
-    <w:p>
-      <w:pPr>
-        <w:pStyle w:val="ListParagraph"/>
-        <w:numPr>
-          <w:ilvl w:val="0"/>
-          <w:numId w:val="1"/>
-        </w:numPr>
-        <w:spacing w:after="80"/>
-      </w:pPr>
-      <w:r>
-        <w:t xml:space="preserve">households: 2 · household_members: 2</w:t>
-      </w:r>
-    </w:p>
-    <w:p>
-      <w:pPr>
-        <w:pStyle w:val="ListParagraph"/>
-        <w:numPr>
-          <w:ilvl w:val="0"/>
-          <w:numId w:val="1"/>
-        </w:numPr>
-        <w:spacing w:after="80"/>
-      </w:pPr>
-      <w:r>
-        <w:t xml:space="preserve">Datos de alnp.alnp (marcados como 'prueba E2E'): 1 paciente, 1 orden médica (etapas Orden y Solicitud completas), 1 medicamento (Metformina 850mg, horarios 08:00/20:00), 1 registro de signos vitales.</w:t>
-      </w:r>
-    </w:p>
-    <w:p>
-      <w:pPr>
-        <w:pStyle w:val="ListParagraph"/>
-        <w:numPr>
-          <w:ilvl w:val="0"/>
-          <w:numId w:val="1"/>
-        </w:numPr>
-        <w:spacing w:after="80"/>
-      </w:pPr>
-      <w:r>
-        <w:t xml:space="preserve">doctors: 0 · medical_centers: 0 (directorios vacíos).</w:t>
+        <w:t>La base de datos de producción está deliberadamente vacía de datos clínicos de nuevo, tras un borrado explícito y confirmado por la usuaria el 2026-07-17 (ver sección dedicada "Cierre de esta tanda" más abajo):</w:t>
+      </w:r>
+    </w:p>
+    <w:p>
+      <w:pPr>
+        <w:pStyle w:val="ListParagraph"/>
+        <w:numPr>
+          <w:ilvl w:val="0"/>
+          <w:numId w:val="1"/>
+        </w:numPr>
+        <w:spacing w:after="80"/>
+      </w:pPr>
+      <w:r>
+        <w:t>auth.users: 3 cuentas reales — se conservan intactas, el borrado fue solo de datos clínicos, nunca de cuentas ni membresías.</w:t>
+      </w:r>
+    </w:p>
+    <w:p>
+      <w:pPr>
+        <w:pStyle w:val="ListParagraph"/>
+        <w:numPr>
+          <w:ilvl w:val="0"/>
+          <w:numId w:val="1"/>
+        </w:numPr>
+        <w:spacing w:after="80"/>
+      </w:pPr>
+      <w:r>
+        <w:t>households: 4 · household_members: 4 — intactos.</w:t>
+      </w:r>
+    </w:p>
+    <w:p>
+      <w:pPr>
+        <w:pStyle w:val="ListParagraph"/>
+        <w:numPr>
+          <w:ilvl w:val="0"/>
+          <w:numId w:val="1"/>
+        </w:numPr>
+        <w:spacing w:after="80"/>
+      </w:pPr>
+      <w:r>
+        <w:t>patients, medical_orders, medications, doctors, medical_centers, vital_signs, patient_policies, patient_diagnoses, order_authorizations, med_usage_events, custom_catalog_options, household_invitations: 0 en todas.</w:t>
+      </w:r>
+    </w:p>
+    <w:p>
+      <w:pPr>
+        <w:pStyle w:val="ListParagraph"/>
+        <w:numPr>
+          <w:ilvl w:val="0"/>
+          <w:numId w:val="1"/>
+        </w:numPr>
+        <w:spacing w:after="80"/>
+      </w:pPr>
+      <w:r>
+        <w:t>Storage: el bucket 'adjuntos' tenía 8 archivos huérfanos (un DELETE por SQL no toca Storage); la usuaria los eliminó manualmente desde el dashboard de Supabase. El bucket queda limpio.</w:t>
       </w:r>
     </w:p>
     <w:p>
@@ -854,7 +854,7 @@
           <w:i w:val="false"/>
           <w:iCs w:val="false"/>
         </w:rPr>
-        <w:t xml:space="preserve">Consecuencia práctica: si se necesita un E2E limpio de nuevo, usar un tercer correo o limpiar estos datos primero. El esquema, funciones, triggers y políticas RLS están intactos.</w:t>
+        <w:t>Consecuencia práctica: la base queda en un estado limpio de fábrica (esquema, funciones, triggers y políticas RLS intactos; cero datos clínicos; cuentas/households/membresías preservados), lista para uso real por la usuaria y su familia, o para un E2E completo por UI del backlog reciente si se quiere verificar contra datos reales antes de confiarle datos propios.</w:t>
       </w:r>
     </w:p>
     <w:p>
@@ -3804,6 +3804,502 @@
         <w:spacing w:after="150" w:before="300"/>
       </w:pPr>
       <w:r>
+        <w:t>Segunda auditoría — Ficha de paciente (completada 2026-07-17)</w:t>
+      </w:r>
+    </w:p>
+    <w:p>
+      <w:pPr>
+        <w:spacing w:after="120"/>
+      </w:pPr>
+      <w:r>
+        <w:rPr>
+          <w:b w:val="false"/>
+          <w:bCs w:val="false"/>
+          <w:i w:val="false"/>
+          <w:iCs w:val="false"/>
+        </w:rPr>
+        <w:t>Cuatro hallazgos que la usuaria reportó tras una revisión rápida de la app en producción (independiente del plan original, de P1.5 y de MI AUDITORIA). Commit 0215e0b + migración 0016.</w:t>
+      </w:r>
+    </w:p>
+    <w:p>
+      <w:pPr>
+        <w:pStyle w:val="ListParagraph"/>
+        <w:numPr>
+          <w:ilvl w:val="0"/>
+          <w:numId w:val="1"/>
+        </w:numPr>
+        <w:spacing w:after="80"/>
+      </w:pPr>
+      <w:r>
+        <w:t>Recorte de imagen al subir: la foto de perfil del paciente y el carnet de una póliza ahora pueden recortarse/encuadrarse antes de guardarse. Nuevo helper compartido src/lib/imageCropper.js (ventana sobrepuesta propia, arrastre + zoom 100–300%), marco circular para el avatar y tipo tarjeta (aspecto 1.586) para el carnet.</w:t>
+      </w:r>
+    </w:p>
+    <w:p>
+      <w:pPr>
+        <w:pStyle w:val="ListParagraph"/>
+        <w:numPr>
+          <w:ilvl w:val="0"/>
+          <w:numId w:val="1"/>
+        </w:numPr>
+        <w:spacing w:after="80"/>
+      </w:pPr>
+      <w:r>
+        <w:t>Editar pólizas y diagnósticos: antes solo se podían eliminar y volver a crear; ahora cada ítem tiene un botón 'Editar' con el mismo mini-formulario precargado. patient_diagnoses no tenía política de UPDATE (el diseño original asumía solo agregar/eliminar) — se agregó api.updatePatientDiagnosis() y la migración 0016 con la política RLS correspondiente, verificada primero en una transacción con rollback.</w:t>
+      </w:r>
+    </w:p>
+    <w:p>
+      <w:pPr>
+        <w:pStyle w:val="ListParagraph"/>
+        <w:numPr>
+          <w:ilvl w:val="0"/>
+          <w:numId w:val="1"/>
+        </w:numPr>
+        <w:spacing w:after="80"/>
+      </w:pPr>
+      <w:r>
+        <w:t>Carnet de póliza ya no se convierte a PDF: si el archivo elegido es una imagen pasa por el recortador y se guarda como imagen; si ya es un PDF escaneado, se sube tal cual.</w:t>
+      </w:r>
+    </w:p>
+    <w:p>
+      <w:pPr>
+        <w:pStyle w:val="ListParagraph"/>
+        <w:numPr>
+          <w:ilvl w:val="0"/>
+          <w:numId w:val="1"/>
+        </w:numPr>
+        <w:spacing w:after="80"/>
+      </w:pPr>
+      <w:r>
+        <w:t>Bug corregido — selector de 'Tipo de póliza' atascado en SOAT: el &lt;select&gt; se reconstruía sin recordar la última elección real del usuario. Ahora un estado explícito (pendingPolicyTipo) la conserva entre reconstrucciones.</w:t>
+      </w:r>
+    </w:p>
+    <w:p>
+      <w:pPr>
+        <w:spacing w:after="120"/>
+      </w:pPr>
+      <w:r>
+        <w:rPr>
+          <w:b w:val="false"/>
+          <w:bCs w:val="false"/>
+          <w:i w:val="false"/>
+          <w:iCs w:val="false"/>
+        </w:rPr>
+        <w:t>Verificación: npm run build limpio y pruebas de interacción con Playwright contra el recortador en aislamiento (zoom, arrastre, cancelar, clamps de zoom, verificación pixel-por-pixel del recorte final). La única escritura contra producción fue la migración 0016 (aditiva), verificada primero con rollback.</w:t>
+      </w:r>
+    </w:p>
+    <w:p>
+      <w:pPr>
+        <w:pStyle w:val="Heading1"/>
+        <w:spacing w:after="150" w:before="300"/>
+      </w:pPr>
+      <w:r>
+        <w:t>Tercera auditoría — Medicamentos (completada 2026-07-17)</w:t>
+      </w:r>
+    </w:p>
+    <w:p>
+      <w:pPr>
+        <w:spacing w:after="120"/>
+      </w:pPr>
+      <w:r>
+        <w:rPr>
+          <w:b w:val="false"/>
+          <w:bCs w:val="false"/>
+          <w:i w:val="false"/>
+          <w:iCs w:val="false"/>
+        </w:rPr>
+        <w:t>Backlog que la usuaria relevó sobre el área de Medicamentos. Cinco frentes, todos completados en la misma sesión, commit 1dd9c8e + migración 0017.</w:t>
+      </w:r>
+    </w:p>
+    <w:p>
+      <w:pPr>
+        <w:pStyle w:val="ListParagraph"/>
+        <w:numPr>
+          <w:ilvl w:val="0"/>
+          <w:numId w:val="1"/>
+        </w:numPr>
+        <w:spacing w:after="80"/>
+      </w:pPr>
+      <w:r>
+        <w:t>Indicación (columna medications.indicacion): texto libre con la enfermedad o síntoma que trata el medicamento — decisión explícita de no enlazarlo al catálogo CIE10 de diagnósticos crónicos. Se muestra en la tarjeta ('Para: …').</w:t>
+      </w:r>
+    </w:p>
+    <w:p>
+      <w:pPr>
+        <w:pStyle w:val="ListParagraph"/>
+        <w:numPr>
+          <w:ilvl w:val="0"/>
+          <w:numId w:val="1"/>
+        </w:numPr>
+        <w:spacing w:after="80"/>
+      </w:pPr>
+      <w:r>
+        <w:t>Medicamento controlado (columna medications.controlado, boolean): checkbox en el formulario; los controlados se destacan con badge y acento rojo, y forman el primer grupo de la lista.</w:t>
+      </w:r>
+    </w:p>
+    <w:p>
+      <w:pPr>
+        <w:pStyle w:val="ListParagraph"/>
+        <w:numPr>
+          <w:ilvl w:val="0"/>
+          <w:numId w:val="1"/>
+        </w:numPr>
+        <w:spacing w:after="80"/>
+      </w:pPr>
+      <w:r>
+        <w:t>Usos de medicamentos 'a demanda' (tabla nueva med_usage_events, migración 0017, RLS verificada con rollback antes de aplicar): botón USADO en la tarjeta y en un widget nuevo del dashboard; pide la razón del uso (obligatoria) y guarda fecha y hora. Tabla append-only (sin UPDATE — corregir es eliminar y re-registrar).</w:t>
+      </w:r>
+    </w:p>
+    <w:p>
+      <w:pPr>
+        <w:pStyle w:val="ListParagraph"/>
+        <w:numPr>
+          <w:ilvl w:val="0"/>
+          <w:numId w:val="1"/>
+        </w:numPr>
+        <w:spacing w:after="80"/>
+      </w:pPr>
+      <w:r>
+        <w:t>Agrupación jerárquica de activos: Medicamentos controlados → Por horario → A demanda (alfabético dentro de cada grupo), más un grupo colapsable de inactivos. Se conserva además el historial de versiones existente por decisión de la usuaria.</w:t>
+      </w:r>
+    </w:p>
+    <w:p>
+      <w:pPr>
+        <w:pStyle w:val="ListParagraph"/>
+        <w:numPr>
+          <w:ilvl w:val="0"/>
+          <w:numId w:val="1"/>
+        </w:numPr>
+        <w:spacing w:after="80"/>
+      </w:pPr>
+      <w:r>
+        <w:t>Unificación Órdenes → Medicamento: al marcar como 'entregado' un mes de una orden de tipo Medicamentos/Insumos/Terapias que antes no lo estaba, se ofrece crear un nuevo medicamento precargado con el nombre de la orden.</w:t>
+      </w:r>
+    </w:p>
+    <w:p>
+      <w:pPr>
+        <w:spacing w:after="120"/>
+      </w:pPr>
+      <w:r>
+        <w:rPr>
+          <w:b w:val="false"/>
+          <w:bCs w:val="false"/>
+          <w:i w:val="false"/>
+          <w:iCs w:val="false"/>
+        </w:rPr>
+        <w:t>Verificación: npm run build limpio y capturas de Playwright de la agrupación completa, el widget del dashboard y el modal de registro de uso. La única escritura contra producción fue la migración 0017 (aditiva), verificada primero con rollback.</w:t>
+      </w:r>
+    </w:p>
+    <w:p>
+      <w:pPr>
+        <w:pStyle w:val="Heading1"/>
+        <w:spacing w:after="150" w:before="300"/>
+      </w:pPr>
+      <w:r>
+        <w:t>Cuarta auditoría — Signos Vitales (completada 2026-07-17)</w:t>
+      </w:r>
+    </w:p>
+    <w:p>
+      <w:pPr>
+        <w:spacing w:after="120"/>
+      </w:pPr>
+      <w:r>
+        <w:rPr>
+          <w:b w:val="false"/>
+          <w:bCs w:val="false"/>
+          <w:i w:val="false"/>
+          <w:iCs w:val="false"/>
+        </w:rPr>
+        <w:t>Auditoría relevada por la usuaria sobre el módulo de Signos Vitales. Se hizo originalmente en otra conversación que trabajaba sobre una copia local separada; en esta sesión se revisó, se verificó su consistencia con el estado actual del repo (diff de api.js confirmó que no se tocó nada de las auditorías de Medicamentos y Pacientes) y se integró. Commit a9753ff + migración 0018.</w:t>
+      </w:r>
+    </w:p>
+    <w:p>
+      <w:pPr>
+        <w:pStyle w:val="ListParagraph"/>
+        <w:numPr>
+          <w:ilvl w:val="0"/>
+          <w:numId w:val="1"/>
+        </w:numPr>
+        <w:spacing w:after="80"/>
+      </w:pPr>
+      <w:r>
+        <w:t>Hora de la toma: campo de hora en el formulario y columna 'Hora' en el historial.</w:t>
+      </w:r>
+    </w:p>
+    <w:p>
+      <w:pPr>
+        <w:pStyle w:val="ListParagraph"/>
+        <w:numPr>
+          <w:ilvl w:val="0"/>
+          <w:numId w:val="1"/>
+        </w:numPr>
+        <w:spacing w:after="80"/>
+      </w:pPr>
+      <w:r>
+        <w:t>Edad automática: se calcula sola como los años cumplidos entre la fecha de nacimiento del paciente y la fecha del registro; el campo es de solo lectura (antes se cargaba a mano y casi siempre quedaba vacía — hallazgo del E2E de P0).</w:t>
+      </w:r>
+    </w:p>
+    <w:p>
+      <w:pPr>
+        <w:pStyle w:val="ListParagraph"/>
+        <w:numPr>
+          <w:ilvl w:val="0"/>
+          <w:numId w:val="1"/>
+        </w:numPr>
+        <w:spacing w:after="80"/>
+      </w:pPr>
+      <w:r>
+        <w:t>Peso por edad: menores de 2 años ingresan el peso en gramos, de 2 años en adelante en kilogramos; internamente siempre se guarda en kg con 3 decimales (peso pasó a numeric(6,3)).</w:t>
+      </w:r>
+    </w:p>
+    <w:p>
+      <w:pPr>
+        <w:pStyle w:val="ListParagraph"/>
+        <w:numPr>
+          <w:ilvl w:val="0"/>
+          <w:numId w:val="1"/>
+        </w:numPr>
+        <w:spacing w:after="80"/>
+      </w:pPr>
+      <w:r>
+        <w:t>Altura / Longitud tibial: selector de modo de medición de estatura; la longitud tibial (cm) reemplaza a la altura cuando se elige ese modo (mutuamente excluyentes en un mismo registro).</w:t>
+      </w:r>
+    </w:p>
+    <w:p>
+      <w:pPr>
+        <w:pStyle w:val="ListParagraph"/>
+        <w:numPr>
+          <w:ilvl w:val="0"/>
+          <w:numId w:val="1"/>
+        </w:numPr>
+        <w:spacing w:after="80"/>
+      </w:pPr>
+      <w:r>
+        <w:t>Frecuencia respiratoria: campo nuevo junto a la frecuencia cardíaca, visible en el historial y, como mejora agregada en esta sesión, también graficable (KPI + evolución).</w:t>
+      </w:r>
+    </w:p>
+    <w:p>
+      <w:pPr>
+        <w:pStyle w:val="ListParagraph"/>
+        <w:numPr>
+          <w:ilvl w:val="0"/>
+          <w:numId w:val="1"/>
+        </w:numPr>
+        <w:spacing w:after="80"/>
+      </w:pPr>
+      <w:r>
+        <w:t>Perímetro cefálico (migración 0019, agregado el 2026-07-17 a pedido de la usuaria): medida de crecimiento rutinaria en lactantes. El campo aparece en Antropometría cuando el paciente es menor de 2 años a la fecha del registro (o si el registro ya tiene el dato), se muestra en el historial y también es graficable, como el resto de perímetros.</w:t>
+      </w:r>
+    </w:p>
+    <w:p>
+      <w:pPr>
+        <w:spacing w:after="120"/>
+      </w:pPr>
+      <w:r>
+        <w:rPr>
+          <w:b w:val="false"/>
+          <w:bCs w:val="false"/>
+          <w:i w:val="false"/>
+          <w:iCs w:val="false"/>
+        </w:rPr>
+        <w:t>Verificación: npm run build limpio y captura de Playwright del formulario y del historial. Pendiente menor a confirmar con la usuaria si alguna vez hiciera falta: el diseño actual no contempla registrar altura y longitud tibial a la vez en el mismo control (son excluyentes).</w:t>
+      </w:r>
+    </w:p>
+    <w:p>
+      <w:pPr>
+        <w:pStyle w:val="Heading1"/>
+        <w:spacing w:after="150" w:before="300"/>
+      </w:pPr>
+      <w:r>
+        <w:t>Cierre de esta tanda — reinicio de datos y verificación final de despliegue (completado 2026-07-17)</w:t>
+      </w:r>
+    </w:p>
+    <w:p>
+      <w:pPr>
+        <w:spacing w:after="120"/>
+      </w:pPr>
+      <w:r>
+        <w:rPr>
+          <w:b w:val="false"/>
+          <w:bCs w:val="false"/>
+          <w:i w:val="false"/>
+          <w:iCs w:val="false"/>
+        </w:rPr>
+        <w:t>Tras cerrar las cuatro auditorías, la usuaria preguntó qué hacía falta para dar la app por terminada 'en este nivel' y usable de verdad, y pidió borrar los datos usados en pruebas E2E antes de ese último paso. Se siguió un protocolo de confirmación explícita en dos tiempos antes de cualquier borrado contra producción.</w:t>
+      </w:r>
+    </w:p>
+    <w:p>
+      <w:pPr>
+        <w:pStyle w:val="ListParagraph"/>
+        <w:numPr>
+          <w:ilvl w:val="0"/>
+          <w:numId w:val="1"/>
+        </w:numPr>
+        <w:spacing w:after="80"/>
+      </w:pPr>
+      <w:r>
+        <w:t>Decisión de alcance: se presentó el conteo real de filas por tabla y por cuenta, distinguiendo datos clínicos (seguro de borrar) de estructura de auth/household/membresía (debe preservarse). La usuaria eligió explícitamente borrar los datos clínicos de las tres cuentas.</w:t>
+      </w:r>
+    </w:p>
+    <w:p>
+      <w:pPr>
+        <w:pStyle w:val="ListParagraph"/>
+        <w:numPr>
+          <w:ilvl w:val="0"/>
+          <w:numId w:val="1"/>
+        </w:numPr>
+        <w:spacing w:after="80"/>
+      </w:pPr>
+      <w:r>
+        <w:t>Confirmación explícita de la sentencia SQL: antes de ejecutar nada se mostró el DELETE exacto y se esperó confirmación literal ('Sí, bórralo') antes de correrlo.</w:t>
+      </w:r>
+    </w:p>
+    <w:p>
+      <w:pPr>
+        <w:pStyle w:val="ListParagraph"/>
+        <w:numPr>
+          <w:ilvl w:val="0"/>
+          <w:numId w:val="1"/>
+        </w:numPr>
+        <w:spacing w:after="80"/>
+      </w:pPr>
+      <w:r>
+        <w:t>Ejecutado y verificado: las 12 tablas clínicas quedaron en 0 filas; auth.users (3), households (4) y household_members (4) quedaron intactos — verificado con una query de verificación inmediatamente después del borrado.</w:t>
+      </w:r>
+    </w:p>
+    <w:p>
+      <w:pPr>
+        <w:pStyle w:val="ListParagraph"/>
+        <w:numPr>
+          <w:ilvl w:val="0"/>
+          <w:numId w:val="1"/>
+        </w:numPr>
+        <w:spacing w:after="80"/>
+      </w:pPr>
+      <w:r>
+        <w:t>Storage: el DELETE por SQL no toca storage.objects; quedaron 8 archivos huérfanos en el bucket 'adjuntos', que la usuaria eliminó a mano desde el dashboard de Supabase.</w:t>
+      </w:r>
+    </w:p>
+    <w:p>
+      <w:pPr>
+        <w:pStyle w:val="ListParagraph"/>
+        <w:numPr>
+          <w:ilvl w:val="0"/>
+          <w:numId w:val="1"/>
+        </w:numPr>
+        <w:spacing w:after="80"/>
+      </w:pPr>
+      <w:r>
+        <w:t>Verificación final de despliegue: se confirmó que el commit del perímetro cefálico (bfa527b) está READY en producción, el deployment más reciente — con esto las cuatro auditorías de esta sesión están confirmadas en línea, no solo mergeadas en main.</w:t>
+      </w:r>
+    </w:p>
+    <w:p>
+      <w:pPr>
+        <w:spacing w:after="120"/>
+      </w:pPr>
+      <w:r>
+        <w:rPr>
+          <w:b w:val="false"/>
+          <w:bCs w:val="false"/>
+          <w:i w:val="false"/>
+          <w:iCs w:val="false"/>
+        </w:rPr>
+        <w:t>Resultado: la app queda con el esquema completo, RLS intacto, cero datos de prueba, y todo el código reciente verificado en producción — lista para uso real por la usuaria y su familia.</w:t>
+      </w:r>
+    </w:p>
+    <w:p>
+      <w:pPr>
+        <w:pStyle w:val="Heading1"/>
+        <w:spacing w:after="150" w:before="300"/>
+      </w:pPr>
+      <w:r>
+        <w:t>Ideas de crecimiento futuro (explícitamente diferidas, no en curso)</w:t>
+      </w:r>
+    </w:p>
+    <w:p>
+      <w:pPr>
+        <w:spacing w:after="120"/>
+      </w:pPr>
+      <w:r>
+        <w:rPr>
+          <w:b w:val="false"/>
+          <w:bCs w:val="false"/>
+          <w:i w:val="false"/>
+          <w:iCs w:val="false"/>
+        </w:rPr>
+        <w:t>La usuaria compartió cinco ideas para ampliar el proyecto, aclarando ella misma que 'pueden ser estudiadas a futuro' porque las considera 'muy grandes en este momento'. Ninguna está diseñada ni tiene tareas asociadas. No iniciar diseño ni implementación de ninguna sin que la usuaria lo pida de nuevo:</w:t>
+      </w:r>
+    </w:p>
+    <w:p>
+      <w:pPr>
+        <w:pStyle w:val="ListParagraph"/>
+        <w:numPr>
+          <w:ilvl w:val="0"/>
+          <w:numId w:val="1"/>
+        </w:numPr>
+        <w:spacing w:after="80"/>
+      </w:pPr>
+      <w:r>
+        <w:t>Sección de vacunación.</w:t>
+      </w:r>
+    </w:p>
+    <w:p>
+      <w:pPr>
+        <w:pStyle w:val="ListParagraph"/>
+        <w:numPr>
+          <w:ilvl w:val="0"/>
+          <w:numId w:val="1"/>
+        </w:numPr>
+        <w:spacing w:after="80"/>
+      </w:pPr>
+      <w:r>
+        <w:t>Ventana completa para hospitalización.</w:t>
+      </w:r>
+    </w:p>
+    <w:p>
+      <w:pPr>
+        <w:pStyle w:val="ListParagraph"/>
+        <w:numPr>
+          <w:ilvl w:val="0"/>
+          <w:numId w:val="1"/>
+        </w:numPr>
+        <w:spacing w:after="80"/>
+      </w:pPr>
+      <w:r>
+        <w:t>Interfaz completa de seguimiento de mujeres embarazadas.</w:t>
+      </w:r>
+    </w:p>
+    <w:p>
+      <w:pPr>
+        <w:pStyle w:val="ListParagraph"/>
+        <w:numPr>
+          <w:ilvl w:val="0"/>
+          <w:numId w:val="1"/>
+        </w:numPr>
+        <w:spacing w:after="80"/>
+      </w:pPr>
+      <w:r>
+        <w:t>Interfaz completa de odontología y salud oral.</w:t>
+      </w:r>
+    </w:p>
+    <w:p>
+      <w:pPr>
+        <w:pStyle w:val="ListParagraph"/>
+        <w:numPr>
+          <w:ilvl w:val="0"/>
+          <w:numId w:val="1"/>
+        </w:numPr>
+        <w:spacing w:after="80"/>
+      </w:pPr>
+      <w:r>
+        <w:t>Roles 'administrador' (para curar el directorio público — se conecta con la pieza A de arquitectura) y 'médico' (para que médicos vean historias clínicas de pacientes que se las compartan).</w:t>
+      </w:r>
+    </w:p>
+    <w:p>
+      <w:pPr>
+        <w:pStyle w:val="Heading1"/>
+        <w:spacing w:after="150" w:before="300"/>
+      </w:pPr>
+      <w:r>
         <w:t xml:space="preserve">Arquitectura futura — estado al 2026-07-16</w:t>
       </w:r>
     </w:p>
@@ -4148,7 +4644,7 @@
         <w:spacing w:after="80"/>
       </w:pPr>
       <w:r>
-        <w:t>Supabase: proyecto smbnogsvqaowfwqchuvy (región sa-east-1), estado ACTIVE_HEALTHY. 15 migraciones aplicadas (0012–0015 del backlog MI AUDITORIA: avatar de paciente, aseguradora de pólizas, diagnósticos crónicos CIE10, y autorizaciones mes a mes de Órdenes).</w:t>
+        <w:t>Supabase: proyecto smbnogsvqaowfwqchuvy (región sa-east-1), estado ACTIVE_HEALTHY. 19 migraciones aplicadas (0012–0015 del backlog MI AUDITORIA; 0016 de la segunda auditoría de Ficha de paciente — RLS de UPDATE en patient_diagnoses; 0017 de la auditoría de Medicamentos — indicacion/controlado + tabla med_usage_events; 0018 de la auditoría de Signos Vitales — hora/frecuencia_respiratoria/longitud_tibial + peso ampliado a numeric(6,3); 0019 — columna per_cefalico, perímetro cefálico de lactantes). Nota: la 0018 quedó registrada en la tabla de migraciones de Supabase con el nombre '0005_vital_signs_auditoria' por trabajarse desde otra conversación sobre una copia local desactualizada — el esquema quedó correcto y el archivo del repo está bien numerado; es solo una inconsistencia cosmética de nombre, no bloqueante (la migración es idempotente).</w:t>
       </w:r>
     </w:p>
     <w:p>
@@ -4174,7 +4670,7 @@
         <w:spacing w:after="80"/>
       </w:pPr>
       <w:r>
-        <w:t xml:space="preserve">GitHub: github.com/alnp18/saludfamilia, rama main. Sin conector MCP disponible — todo el trabajo de código se aplica manualmente desde PowerShell local (git add / commit / push).</w:t>
+        <w:t>GitHub: github.com/alnp18/saludfamilia, rama main. Sin conector MCP ni credenciales de git push en el sandbox de las sesiones. Patrón de entrega preferido (desde la segunda auditoría en adelante): Claude edita y commitea en su propio sandbox solo para su historial/diff, y entrega los archivos finales escribiéndolos directamente en el disco de la usuaria (mismo clon local en su equipo) vía el puente de dispositivo; es la usuaria quien corre git add/commit/push desde su PowerShell. Un push a main a veces no dispara el webhook de Vercel (visto con el commit del perímetro cefálico) — el remedio simple es un segundo push, aunque sea un commit vacío; verificar siempre con Vercel:list_deployments tras cualquier push.</w:t>
       </w:r>
     </w:p>
     <w:p>
@@ -4222,59 +4718,59 @@
         <w:spacing w:after="80"/>
       </w:pPr>
       <w:r>
-        <w:t>P2 #11 — Estados vacíos y manejo de errores consistente: ✅ COMPLETADA el 2026-07-16 (ver sección dedicada de Prioridad P2). No queda ningún ítem numerado pendiente del plan original.</w:t>
-      </w:r>
-    </w:p>
-    <w:p>
-      <w:pPr>
-        <w:pStyle w:val="ListParagraph"/>
-        <w:numPr>
-          <w:ilvl w:val="0"/>
-          <w:numId w:val="1"/>
-        </w:numPr>
-        <w:spacing w:after="80"/>
-      </w:pPr>
-      <w:r>
-        <w:t>Diseño detallado de la pieza A (directorio público auditado) con Fable, cuando se decida priorizarla.</w:t>
-      </w:r>
-    </w:p>
-    <w:p>
-      <w:pPr>
-        <w:pStyle w:val="ListParagraph"/>
-        <w:numPr>
-          <w:ilvl w:val="0"/>
-          <w:numId w:val="1"/>
-        </w:numPr>
-        <w:spacing w:after="80"/>
-      </w:pPr>
-      <w:r>
-        <w:t>Decidir qué hacer con los datos de prueba conservados en producción tras los E2E (dejarlos como muestra o limpiarlos antes del lanzamiento real).</w:t>
-      </w:r>
-    </w:p>
-    <w:p>
-      <w:pPr>
-        <w:pStyle w:val="ListParagraph"/>
-        <w:numPr>
-          <w:ilvl w:val="0"/>
-          <w:numId w:val="1"/>
-        </w:numPr>
-        <w:spacing w:after="80"/>
-      </w:pPr>
-      <w:r>
-        <w:t>Si algún día se pasa al plan Pro de Supabase: activar "Leaked password protection" (HaveIBeenPwned) en Auth — quedó rechazado por la API en el plan gratuito; el mínimo de contraseña ya se subió a 8.</w:t>
-      </w:r>
-    </w:p>
-    <w:p>
-      <w:pPr>
-        <w:pStyle w:val="ListParagraph"/>
-        <w:numPr>
-          <w:ilvl w:val="0"/>
-          <w:numId w:val="1"/>
-        </w:numPr>
-        <w:spacing w:after="80"/>
-      </w:pPr>
-      <w:r>
-        <w:t xml:space="preserve">Si algún día se pasa al plan Pro de Supabase: activar 'Leaked password protection' (HaveIBeenPwned) en Auth — quedó rechazado por la API en el plan gratuito; el mínimo de contraseña ya se subió a 8.</w:t>
+        <w:t>Uso real por la usuaria y su familia: con P1.5, P2, MI AUDITORIA y las tres auditorías adicionales (Ficha de paciente #2, Medicamentos, Signos Vitales) completas y confirmadas en línea, y la base de datos reiniciada (ver sección de Cierre de esta tanda), no queda ningún ítem numerado pendiente del plan. Cualquier dato cargado de ahora en más es real, no de prueba.</w:t>
+      </w:r>
+    </w:p>
+    <w:p>
+      <w:pPr>
+        <w:pStyle w:val="ListParagraph"/>
+        <w:numPr>
+          <w:ilvl w:val="0"/>
+          <w:numId w:val="1"/>
+        </w:numPr>
+        <w:spacing w:after="80"/>
+      </w:pPr>
+      <w:r>
+        <w:t>Diseño detallado de la pieza A (directorio público auditado) con Fable, cuando se decida priorizarla — se relaciona con la idea diferida del rol 'administrador' (ver sección de Ideas de crecimiento futuro).</w:t>
+      </w:r>
+    </w:p>
+    <w:p>
+      <w:pPr>
+        <w:pStyle w:val="ListParagraph"/>
+        <w:numPr>
+          <w:ilvl w:val="0"/>
+          <w:numId w:val="1"/>
+        </w:numPr>
+        <w:spacing w:after="80"/>
+      </w:pPr>
+      <w:r>
+        <w:t>Las cinco ideas de crecimiento futuro relevadas por la usuaria (vacunación, hospitalización, embarazo, odontología, roles admin/médico) están explícitamente diferidas — no diseñar ni implementar ninguna sin que la usuaria lo pida de nuevo. Ver sección dedicada.</w:t>
+      </w:r>
+    </w:p>
+    <w:p>
+      <w:pPr>
+        <w:pStyle w:val="ListParagraph"/>
+        <w:numPr>
+          <w:ilvl w:val="0"/>
+          <w:numId w:val="1"/>
+        </w:numPr>
+        <w:spacing w:after="80"/>
+      </w:pPr>
+      <w:r>
+        <w:t>Si algún día se pasa al plan Pro de Supabase: activar 'Leaked password protection' (HaveIBeenPwned) en Auth — hoy rechazado por la API en el plan gratuito; el mínimo de contraseña ya se subió a 8 caracteres.</w:t>
+      </w:r>
+    </w:p>
+    <w:p>
+      <w:pPr>
+        <w:pStyle w:val="ListParagraph"/>
+        <w:numPr>
+          <w:ilvl w:val="0"/>
+          <w:numId w:val="1"/>
+        </w:numPr>
+        <w:spacing w:after="80"/>
+      </w:pPr>
+      <w:r>
+        <w:t>Antes de tocar cualquier política RLS nueva: reproducir el cambio primero con 'set local role authenticated' + 'request.jwt.claims' simulados en una transacción con rollback (patrón usado con éxito en todos los E2E de seguridad de este proyecto).</w:t>
       </w:r>
     </w:p>
     <w:sectPr>

</xml_diff>

<commit_message>
Pieza A: directorio publico auditado de medicos y centros
</commit_message>
<xml_diff>
--- a/docs/Plan_de_Avance_MVP.docx
+++ b/docs/Plan_de_Avance_MVP.docx
@@ -36,7 +36,7 @@
           <w:i/>
           <w:iCs/>
         </w:rPr>
-        <w:t>Actualizado el 2026-07-17 · Versión unificada (plan original + verificación E2E en producción + recuperación de contraseña + invitaciones al household + exportar/importar + Storage + auditoría RLS + P1.5 + P2 + MI AUDITORIA + segunda auditoría de Ficha de paciente + tercera auditoría de Medicamentos + cuarta auditoría de Signos Vitales (incl. perímetro cefálico) + cierre de esta tanda: reinicio de datos de prueba y verificación final de despliegue)</w:t>
+        <w:t>Actualizado el 2026-07-17 · Versión unificada (plan original + verificación E2E en producción + recuperación de contraseña + invitaciones al household + exportar/importar + Storage + auditoría RLS + P1.5 + P2 + MI AUDITORIA + segunda auditoría de Ficha de paciente + tercera auditoría de Medicamentos + cuarta auditoría de Signos Vitales (incl. perímetro cefálico) + cierre de esa tanda con reinicio de datos de prueba + PIEZA A DE ARQUITECTURA COMPLETADA: directorio público auditado de médicos y centros. El plan queda CERRADO: sin frentes pendientes)</w:t>
       </w:r>
     </w:p>
     <w:p>
@@ -99,7 +99,7 @@
         <w:spacing w:after="80"/>
       </w:pPr>
       <w:r>
-        <w:t>Arquitectura restante: pieza A, directorio público auditado de médicos y centros — Fable, pendiente de diseño detallado.</w:t>
+        <w:t>Arquitectura restante: ninguna. La pieza A (directorio público auditado de médicos y centros) se COMPLETÓ el 2026-07-17 (Fable): migración 0020 aplicada tras 24/24 pruebas RLS en transacción con rollback, y vista nueva "Directorio público" con el flujo proponer → revisar → publicar → copiar. Ver la sección de Arquitectura futura para el diseño final.</w:t>
       </w:r>
     </w:p>
     <w:p>
@@ -4291,7 +4291,7 @@
         <w:spacing w:after="80"/>
       </w:pPr>
       <w:r>
-        <w:t>Roles 'administrador' (para curar el directorio público — se conecta con la pieza A de arquitectura) y 'médico' (para que médicos vean historias clínicas de pacientes que se las compartan).</w:t>
+        <w:t>Roles 'administrador' (la parte de curación del directorio quedó CUBIERTA por la pieza A completada: tabla app_admins, hoy alnp) y 'médico' (para que médicos vean historias clínicas de pacientes que se las compartan).</w:t>
       </w:r>
     </w:p>
     <w:p>
@@ -4314,7 +4314,7 @@
           <w:i w:val="false"/>
           <w:iCs w:val="false"/>
         </w:rPr>
-        <w:t xml:space="preserve">De las dos piezas originales, la B (exportar/importar pacientes) YA SE IMPLEMENTÓ con un diseño distinto al conversado — ver la sección de resultados más arriba. Queda pendiente solo la pieza A. El texto original de ambas se conserva a continuación como referencia del diseño conversado.</w:t>
+        <w:t xml:space="preserve">Las DOS piezas originales están implementadas: la B (exportar/importar pacientes) el 2026-07-15 con un diseño distinto al conversado, y la A (directorio público auditado) el 2026-07-17 con el diseño acordado más las decisiones de detalle cerradas con el usuario. El texto original de ambas se conserva a continuación como referencia, precedido por el resultado final de la A.</w:t>
       </w:r>
     </w:p>
     <w:p>
@@ -4323,7 +4323,7 @@
         <w:spacing w:after="120" w:before="240"/>
       </w:pPr>
       <w:r>
-        <w:t xml:space="preserve">A. Directorio público auditado de centros médicos y médicos</w:t>
+        <w:t xml:space="preserve">A. Directorio público auditado de centros médicos y médicos — ✅ COMPLETADA (2026-07-17)</w:t>
       </w:r>
     </w:p>
     <w:p>
@@ -4337,7 +4337,7 @@
           <w:i w:val="false"/>
           <w:iCs w:val="false"/>
         </w:rPr>
-        <w:t xml:space="preserve">Hoy 'doctors' y 'centers' están aislados por household (RLS vía is_household_member), igual que los pacientes — verificado también en el E2E del 2026-07-15. Se evaluó hacerlos públicos sin restricciones y se descartó por: riesgo de que cualquier usuario altere entradas que otras familias usan activamente, ausencia de curación (duplicados, errores sin control), y por tratarse de una excepción al aislamiento por household que es la base de todo el modelo de seguridad actual.</w:t>
+        <w:t xml:space="preserve">RESULTADO FINAL (migración 0020 + vista 'Directorio público'): tablas globales public_doctors/public_centers con ciclo de vida pendiente → publicado | rechazado (nota de rechazo visible para la proponente; quién/cuándo revisó lo llena un trigger del servidor); rol de administradora en app_admins (decisión del usuario: la cuenta de alnp; se administra solo por SQL) con chequeo private.is_app_admin(); entradas por propuesta manual desde Médicos/Centros (modal que muestra qué se envía; el centro viaja como texto) + alta directa de la admin; pestañas Médicos/Centros/Mis propuestas/Revisión; usar una entrada = copiarla al directorio privado con referencia de origen public_source_id (FK con on delete set null — borrar del directorio nunca toca las copias), sin poder re-proponer lo copiado o ya propuesto (un rechazo sí permite reintentar); anon sin acceso; RLS verificada con 24/24 pruebas (tres identidades + anon, JWT simulado, rollback) ANTES de aplicar. En exportar/importar, la procedencia se descarta al importar (un id viejo podría ya no existir). — Contexto original que motivó el diseño: hoy 'doctors' y 'centers' están aislados por household (RLS vía is_household_member), igual que los pacientes — verificado también en el E2E del 2026-07-15. Se evaluó hacerlos públicos sin restricciones y se descartó por: riesgo de que cualquier usuario altere entradas que otras familias usan activamente, ausencia de curación (duplicados, errores sin control), y por tratarse de una excepción al aislamiento por household que es la base de todo el modelo de seguridad actual.</w:t>
       </w:r>
     </w:p>
     <w:p>
@@ -4555,7 +4555,7 @@
                 <w:b w:val="false"/>
                 <w:bCs w:val="false"/>
               </w:rPr>
-              <w:t xml:space="preserve">Todo lo que toque seguridad RLS y migraciones de datos — errores ahí son irreversibles o pueden filtrar datos médicos entre familias. Ya ejecutó: invitaciones (P1 #6), exportar/importar (pieza B), Storage (P1 #7) y auditoría RLS (P1 #8). Del plan actual le queda solo la pieza A (directorio público auditado) y cualquier cambio futuro de RLS/esquema.</w:t>
+              <w:t xml:space="preserve">Todo lo que toque seguridad RLS y migraciones de datos — errores ahí son irreversibles o pueden filtrar datos médicos entre familias. Ya ejecutó: invitaciones (P1 #6), exportar/importar (pieza B), Storage (P1 #7) y auditoría RLS (P1 #8). Con la pieza A completada el 2026-07-17 no le queda ningún ítem del plan; le corresponde cualquier cambio futuro de RLS/esquema.</w:t>
             </w:r>
           </w:p>
         </w:tc>
@@ -4644,7 +4644,7 @@
         <w:spacing w:after="80"/>
       </w:pPr>
       <w:r>
-        <w:t>Supabase: proyecto smbnogsvqaowfwqchuvy (región sa-east-1), estado ACTIVE_HEALTHY. 19 migraciones aplicadas (0012–0015 del backlog MI AUDITORIA; 0016 de la segunda auditoría de Ficha de paciente — RLS de UPDATE en patient_diagnoses; 0017 de la auditoría de Medicamentos — indicacion/controlado + tabla med_usage_events; 0018 de la auditoría de Signos Vitales — hora/frecuencia_respiratoria/longitud_tibial + peso ampliado a numeric(6,3); 0019 — columna per_cefalico, perímetro cefálico de lactantes). Nota: la 0018 quedó registrada en la tabla de migraciones de Supabase con el nombre '0005_vital_signs_auditoria' por trabajarse desde otra conversación sobre una copia local desactualizada — el esquema quedó correcto y el archivo del repo está bien numerado; es solo una inconsistencia cosmética de nombre, no bloqueante (la migración es idempotente).</w:t>
+        <w:t>Supabase: proyecto smbnogsvqaowfwqchuvy (región sa-east-1), estado ACTIVE_HEALTHY. 20 migraciones aplicadas (0012–0015 del backlog MI AUDITORIA; 0016 de la segunda auditoría de Ficha de paciente — RLS de UPDATE en patient_diagnoses; 0017 de la auditoría de Medicamentos — indicacion/controlado + tabla med_usage_events; 0018 de la auditoría de Signos Vitales — hora/frecuencia_respiratoria/longitud_tibial + peso ampliado a numeric(6,3); 0019 — columna per_cefalico, perímetro cefálico de lactantes; 0020 — pieza A: app_admins, public_doctors/public_centers con RLS, private.is_app_admin(), trigger de auditoría de revisión y public_source_id en doctors/medical_centers). Nota: la 0018 quedó registrada en la tabla de migraciones de Supabase con el nombre '0005_vital_signs_auditoria' por trabajarse desde otra conversación sobre una copia local desactualizada — el esquema quedó correcto y el archivo del repo está bien numerado; es solo una inconsistencia cosmética de nombre, no bloqueante (la migración es idempotente).</w:t>
       </w:r>
     </w:p>
     <w:p>
@@ -4731,7 +4731,7 @@
         <w:spacing w:after="80"/>
       </w:pPr>
       <w:r>
-        <w:t>Diseño detallado de la pieza A (directorio público auditado) con Fable, cuando se decida priorizarla — se relaciona con la idea diferida del rol 'administrador' (ver sección de Ideas de crecimiento futuro).</w:t>
+        <w:t>Pieza A: COMPLETADA el 2026-07-17 y en producción. Operación del rol admin: agregar/quitar administradoras es un INSERT/DELETE en app_admins por SQL (sin interfaz, por diseño); hoy la única admin es alnp. Pendiente natural no bloqueante: primer uso real del flujo por alnp (proponer → aprobar → copiar) como E2E de producción.</w:t>
       </w:r>
     </w:p>
     <w:p>

</xml_diff>